<commit_message>
ADBO Week 2 - Domain Model revision
</commit_message>
<xml_diff>
--- a/adbo/week-2/Week2-DomainModel.docx
+++ b/adbo/week-2/Week2-DomainModel.docx
@@ -425,7 +425,7 @@
           <w:rFonts w:ascii="Times New Roman" w:hAnsi="Times New Roman" w:cs="Times New Roman"/>
           <w:color w:val="000000" w:themeColor="text1"/>
         </w:rPr>
-        <w:t>Student</w:t>
+        <w:t>Department</w:t>
       </w:r>
     </w:p>
     <w:p>
@@ -467,7 +467,7 @@
           <w:rFonts w:ascii="Times New Roman" w:hAnsi="Times New Roman" w:cs="Times New Roman"/>
           <w:color w:val="000000" w:themeColor="text1"/>
         </w:rPr>
-        <w:t>Department</w:t>
+        <w:t>Student</w:t>
       </w:r>
     </w:p>
     <w:p>
@@ -579,6 +579,27 @@
     </w:p>
     <w:p>
       <w:pPr>
+        <w:pStyle w:val="ListParagraph"/>
+        <w:numPr>
+          <w:ilvl w:val="0"/>
+          <w:numId w:val="3"/>
+        </w:numPr>
+        <w:spacing w:line="360" w:lineRule="auto"/>
+        <w:rPr>
+          <w:rFonts w:ascii="Times New Roman" w:hAnsi="Times New Roman" w:cs="Times New Roman"/>
+          <w:color w:val="000000" w:themeColor="text1"/>
+        </w:rPr>
+      </w:pPr>
+      <w:r>
+        <w:rPr>
+          <w:rFonts w:ascii="Times New Roman" w:hAnsi="Times New Roman" w:cs="Times New Roman"/>
+          <w:color w:val="000000" w:themeColor="text1"/>
+        </w:rPr>
+        <w:t>UKMCriteria</w:t>
+      </w:r>
+    </w:p>
+    <w:p>
+      <w:pPr>
         <w:spacing w:line="360" w:lineRule="auto"/>
         <w:rPr>
           <w:rFonts w:ascii="Times New Roman" w:hAnsi="Times New Roman" w:cs="Times New Roman"/>
@@ -684,6 +705,13 @@
           <w:rFonts w:ascii="Times New Roman" w:hAnsi="Times New Roman" w:cs="Times New Roman"/>
           <w:color w:val="000000" w:themeColor="text1"/>
         </w:rPr>
+        <w:t>#</w:t>
+      </w:r>
+      <w:r>
+        <w:rPr>
+          <w:rFonts w:ascii="Times New Roman" w:hAnsi="Times New Roman" w:cs="Times New Roman"/>
+          <w:color w:val="000000" w:themeColor="text1"/>
+        </w:rPr>
         <w:t>id: string</w:t>
       </w:r>
     </w:p>
@@ -707,6 +735,13 @@
           <w:rFonts w:ascii="Times New Roman" w:hAnsi="Times New Roman" w:cs="Times New Roman"/>
           <w:color w:val="000000" w:themeColor="text1"/>
         </w:rPr>
+        <w:t>#</w:t>
+      </w:r>
+      <w:r>
+        <w:rPr>
+          <w:rFonts w:ascii="Times New Roman" w:hAnsi="Times New Roman" w:cs="Times New Roman"/>
+          <w:color w:val="000000" w:themeColor="text1"/>
+        </w:rPr>
         <w:t>name: string</w:t>
       </w:r>
     </w:p>
@@ -725,13 +760,50 @@
           <w:color w:val="000000" w:themeColor="text1"/>
         </w:rPr>
       </w:pPr>
+      <w:r>
+        <w:rPr>
+          <w:rFonts w:ascii="Times New Roman" w:hAnsi="Times New Roman" w:cs="Times New Roman"/>
+          <w:color w:val="000000" w:themeColor="text1"/>
+        </w:rPr>
+        <w:t>#</w:t>
+      </w:r>
+      <w:r>
+        <w:rPr>
+          <w:rFonts w:ascii="Times New Roman" w:hAnsi="Times New Roman" w:cs="Times New Roman"/>
+          <w:color w:val="000000" w:themeColor="text1"/>
+        </w:rPr>
+        <w:t>createDepartment(name)</w:t>
+      </w:r>
+    </w:p>
+    <w:p>
+      <w:pPr>
+        <w:pStyle w:val="ListParagraph"/>
+        <w:numPr>
+          <w:ilvl w:val="1"/>
+          <w:numId w:val="5"/>
+        </w:numPr>
+        <w:spacing w:line="360" w:lineRule="auto"/>
+        <w:rPr>
+          <w:rFonts w:ascii="Times New Roman" w:hAnsi="Times New Roman" w:cs="Times New Roman"/>
+          <w:b/>
+          <w:bCs/>
+          <w:color w:val="000000" w:themeColor="text1"/>
+        </w:rPr>
+      </w:pPr>
+      <w:r>
+        <w:rPr>
+          <w:rFonts w:ascii="Times New Roman" w:hAnsi="Times New Roman" w:cs="Times New Roman"/>
+          <w:color w:val="000000" w:themeColor="text1"/>
+        </w:rPr>
+        <w:t>+</w:t>
+      </w:r>
       <w:proofErr w:type="spellStart"/>
       <w:r>
         <w:rPr>
           <w:rFonts w:ascii="Times New Roman" w:hAnsi="Times New Roman" w:cs="Times New Roman"/>
           <w:color w:val="000000" w:themeColor="text1"/>
         </w:rPr>
-        <w:t>createDepartment</w:t>
+        <w:t>getAllDepartment</w:t>
       </w:r>
       <w:proofErr w:type="spellEnd"/>
       <w:r>
@@ -739,7 +811,7 @@
           <w:rFonts w:ascii="Times New Roman" w:hAnsi="Times New Roman" w:cs="Times New Roman"/>
           <w:color w:val="000000" w:themeColor="text1"/>
         </w:rPr>
-        <w:t>(name)</w:t>
+        <w:t>()</w:t>
       </w:r>
     </w:p>
     <w:p>
@@ -757,38 +829,13 @@
           <w:color w:val="000000" w:themeColor="text1"/>
         </w:rPr>
       </w:pPr>
-      <w:proofErr w:type="spellStart"/>
-      <w:r>
-        <w:rPr>
-          <w:rFonts w:ascii="Times New Roman" w:hAnsi="Times New Roman" w:cs="Times New Roman"/>
-          <w:color w:val="000000" w:themeColor="text1"/>
-        </w:rPr>
-        <w:t>getAllDepartment</w:t>
-      </w:r>
-      <w:proofErr w:type="spellEnd"/>
-      <w:r>
-        <w:rPr>
-          <w:rFonts w:ascii="Times New Roman" w:hAnsi="Times New Roman" w:cs="Times New Roman"/>
-          <w:color w:val="000000" w:themeColor="text1"/>
-        </w:rPr>
-        <w:t>()</w:t>
-      </w:r>
-    </w:p>
-    <w:p>
-      <w:pPr>
-        <w:pStyle w:val="ListParagraph"/>
-        <w:numPr>
-          <w:ilvl w:val="1"/>
-          <w:numId w:val="5"/>
-        </w:numPr>
-        <w:spacing w:line="360" w:lineRule="auto"/>
-        <w:rPr>
-          <w:rFonts w:ascii="Times New Roman" w:hAnsi="Times New Roman" w:cs="Times New Roman"/>
-          <w:b/>
-          <w:bCs/>
-          <w:color w:val="000000" w:themeColor="text1"/>
-        </w:rPr>
-      </w:pPr>
+      <w:r>
+        <w:rPr>
+          <w:rFonts w:ascii="Times New Roman" w:hAnsi="Times New Roman" w:cs="Times New Roman"/>
+          <w:color w:val="000000" w:themeColor="text1"/>
+        </w:rPr>
+        <w:t>+</w:t>
+      </w:r>
       <w:proofErr w:type="spellStart"/>
       <w:r>
         <w:rPr>
@@ -851,6 +898,13 @@
           <w:rFonts w:ascii="Times New Roman" w:hAnsi="Times New Roman" w:cs="Times New Roman"/>
           <w:color w:val="000000" w:themeColor="text1"/>
         </w:rPr>
+        <w:t>#</w:t>
+      </w:r>
+      <w:r>
+        <w:rPr>
+          <w:rFonts w:ascii="Times New Roman" w:hAnsi="Times New Roman" w:cs="Times New Roman"/>
+          <w:color w:val="000000" w:themeColor="text1"/>
+        </w:rPr>
         <w:t>id: string</w:t>
       </w:r>
     </w:p>
@@ -874,6 +928,13 @@
           <w:rFonts w:ascii="Times New Roman" w:hAnsi="Times New Roman" w:cs="Times New Roman"/>
           <w:color w:val="000000" w:themeColor="text1"/>
         </w:rPr>
+        <w:t>#</w:t>
+      </w:r>
+      <w:r>
+        <w:rPr>
+          <w:rFonts w:ascii="Times New Roman" w:hAnsi="Times New Roman" w:cs="Times New Roman"/>
+          <w:color w:val="000000" w:themeColor="text1"/>
+        </w:rPr>
         <w:t>name: string</w:t>
       </w:r>
     </w:p>
@@ -897,6 +958,13 @@
           <w:rFonts w:ascii="Times New Roman" w:hAnsi="Times New Roman" w:cs="Times New Roman"/>
           <w:color w:val="000000" w:themeColor="text1"/>
         </w:rPr>
+        <w:t>#</w:t>
+      </w:r>
+      <w:r>
+        <w:rPr>
+          <w:rFonts w:ascii="Times New Roman" w:hAnsi="Times New Roman" w:cs="Times New Roman"/>
+          <w:color w:val="000000" w:themeColor="text1"/>
+        </w:rPr>
         <w:t>department: Department</w:t>
       </w:r>
     </w:p>
@@ -915,6 +983,13 @@
           <w:color w:val="000000" w:themeColor="text1"/>
         </w:rPr>
       </w:pPr>
+      <w:r>
+        <w:rPr>
+          <w:rFonts w:ascii="Times New Roman" w:hAnsi="Times New Roman" w:cs="Times New Roman"/>
+          <w:color w:val="000000" w:themeColor="text1"/>
+        </w:rPr>
+        <w:t>+</w:t>
+      </w:r>
       <w:proofErr w:type="spellStart"/>
       <w:r>
         <w:rPr>
@@ -947,6 +1022,13 @@
           <w:color w:val="000000" w:themeColor="text1"/>
         </w:rPr>
       </w:pPr>
+      <w:r>
+        <w:rPr>
+          <w:rFonts w:ascii="Times New Roman" w:hAnsi="Times New Roman" w:cs="Times New Roman"/>
+          <w:color w:val="000000" w:themeColor="text1"/>
+        </w:rPr>
+        <w:t>+</w:t>
+      </w:r>
       <w:proofErr w:type="spellStart"/>
       <w:r>
         <w:rPr>
@@ -979,6 +1061,13 @@
           <w:color w:val="000000" w:themeColor="text1"/>
         </w:rPr>
       </w:pPr>
+      <w:r>
+        <w:rPr>
+          <w:rFonts w:ascii="Times New Roman" w:hAnsi="Times New Roman" w:cs="Times New Roman"/>
+          <w:color w:val="000000" w:themeColor="text1"/>
+        </w:rPr>
+        <w:t>+</w:t>
+      </w:r>
       <w:proofErr w:type="spellStart"/>
       <w:r>
         <w:rPr>
@@ -1064,6 +1153,13 @@
           <w:rFonts w:ascii="Times New Roman" w:hAnsi="Times New Roman" w:cs="Times New Roman"/>
           <w:color w:val="000000" w:themeColor="text1"/>
         </w:rPr>
+        <w:t>#</w:t>
+      </w:r>
+      <w:r>
+        <w:rPr>
+          <w:rFonts w:ascii="Times New Roman" w:hAnsi="Times New Roman" w:cs="Times New Roman"/>
+          <w:color w:val="000000" w:themeColor="text1"/>
+        </w:rPr>
         <w:t>id: string</w:t>
       </w:r>
     </w:p>
@@ -1087,6 +1183,13 @@
           <w:rFonts w:ascii="Times New Roman" w:hAnsi="Times New Roman" w:cs="Times New Roman"/>
           <w:color w:val="000000" w:themeColor="text1"/>
         </w:rPr>
+        <w:t>#</w:t>
+      </w:r>
+      <w:r>
+        <w:rPr>
+          <w:rFonts w:ascii="Times New Roman" w:hAnsi="Times New Roman" w:cs="Times New Roman"/>
+          <w:color w:val="000000" w:themeColor="text1"/>
+        </w:rPr>
         <w:t>name: string</w:t>
       </w:r>
     </w:p>
@@ -1110,6 +1213,13 @@
           <w:rFonts w:ascii="Times New Roman" w:hAnsi="Times New Roman" w:cs="Times New Roman"/>
           <w:color w:val="000000" w:themeColor="text1"/>
         </w:rPr>
+        <w:t>#</w:t>
+      </w:r>
+      <w:r>
+        <w:rPr>
+          <w:rFonts w:ascii="Times New Roman" w:hAnsi="Times New Roman" w:cs="Times New Roman"/>
+          <w:color w:val="000000" w:themeColor="text1"/>
+        </w:rPr>
         <w:t>nim: string</w:t>
       </w:r>
     </w:p>
@@ -1133,6 +1243,13 @@
           <w:rFonts w:ascii="Times New Roman" w:hAnsi="Times New Roman" w:cs="Times New Roman"/>
           <w:color w:val="000000" w:themeColor="text1"/>
         </w:rPr>
+        <w:t>#</w:t>
+      </w:r>
+      <w:r>
+        <w:rPr>
+          <w:rFonts w:ascii="Times New Roman" w:hAnsi="Times New Roman" w:cs="Times New Roman"/>
+          <w:color w:val="000000" w:themeColor="text1"/>
+        </w:rPr>
         <w:t>class: Class</w:t>
       </w:r>
     </w:p>
@@ -1151,6 +1268,13 @@
           <w:color w:val="000000" w:themeColor="text1"/>
         </w:rPr>
       </w:pPr>
+      <w:r>
+        <w:rPr>
+          <w:rFonts w:ascii="Times New Roman" w:hAnsi="Times New Roman" w:cs="Times New Roman"/>
+          <w:color w:val="000000" w:themeColor="text1"/>
+        </w:rPr>
+        <w:t>+</w:t>
+      </w:r>
       <w:proofErr w:type="spellStart"/>
       <w:r>
         <w:rPr>
@@ -1183,6 +1307,13 @@
           <w:color w:val="000000" w:themeColor="text1"/>
         </w:rPr>
       </w:pPr>
+      <w:r>
+        <w:rPr>
+          <w:rFonts w:ascii="Times New Roman" w:hAnsi="Times New Roman" w:cs="Times New Roman"/>
+          <w:color w:val="000000" w:themeColor="text1"/>
+        </w:rPr>
+        <w:t>+</w:t>
+      </w:r>
       <w:proofErr w:type="spellStart"/>
       <w:r>
         <w:rPr>
@@ -1215,6 +1346,13 @@
           <w:color w:val="000000" w:themeColor="text1"/>
         </w:rPr>
       </w:pPr>
+      <w:r>
+        <w:rPr>
+          <w:rFonts w:ascii="Times New Roman" w:hAnsi="Times New Roman" w:cs="Times New Roman"/>
+          <w:color w:val="000000" w:themeColor="text1"/>
+        </w:rPr>
+        <w:t>+</w:t>
+      </w:r>
       <w:proofErr w:type="spellStart"/>
       <w:r>
         <w:rPr>
@@ -1277,6 +1415,13 @@
           <w:rFonts w:ascii="Times New Roman" w:hAnsi="Times New Roman" w:cs="Times New Roman"/>
           <w:color w:val="000000" w:themeColor="text1"/>
         </w:rPr>
+        <w:t>#</w:t>
+      </w:r>
+      <w:r>
+        <w:rPr>
+          <w:rFonts w:ascii="Times New Roman" w:hAnsi="Times New Roman" w:cs="Times New Roman"/>
+          <w:color w:val="000000" w:themeColor="text1"/>
+        </w:rPr>
         <w:t>id: string</w:t>
       </w:r>
     </w:p>
@@ -1300,6 +1445,13 @@
           <w:rFonts w:ascii="Times New Roman" w:hAnsi="Times New Roman" w:cs="Times New Roman"/>
           <w:color w:val="000000" w:themeColor="text1"/>
         </w:rPr>
+        <w:t>#</w:t>
+      </w:r>
+      <w:r>
+        <w:rPr>
+          <w:rFonts w:ascii="Times New Roman" w:hAnsi="Times New Roman" w:cs="Times New Roman"/>
+          <w:color w:val="000000" w:themeColor="text1"/>
+        </w:rPr>
         <w:t>name: string</w:t>
       </w:r>
     </w:p>
@@ -1323,6 +1475,13 @@
           <w:rFonts w:ascii="Times New Roman" w:hAnsi="Times New Roman" w:cs="Times New Roman"/>
           <w:color w:val="000000" w:themeColor="text1"/>
         </w:rPr>
+        <w:t>#</w:t>
+      </w:r>
+      <w:r>
+        <w:rPr>
+          <w:rFonts w:ascii="Times New Roman" w:hAnsi="Times New Roman" w:cs="Times New Roman"/>
+          <w:color w:val="000000" w:themeColor="text1"/>
+        </w:rPr>
         <w:t>description: string</w:t>
       </w:r>
     </w:p>
@@ -1346,6 +1505,13 @@
           <w:rFonts w:ascii="Times New Roman" w:hAnsi="Times New Roman" w:cs="Times New Roman"/>
           <w:color w:val="000000" w:themeColor="text1"/>
         </w:rPr>
+        <w:t>#</w:t>
+      </w:r>
+      <w:r>
+        <w:rPr>
+          <w:rFonts w:ascii="Times New Roman" w:hAnsi="Times New Roman" w:cs="Times New Roman"/>
+          <w:color w:val="000000" w:themeColor="text1"/>
+        </w:rPr>
         <w:t>leader: Student</w:t>
       </w:r>
     </w:p>
@@ -1364,6 +1530,13 @@
           <w:color w:val="000000" w:themeColor="text1"/>
         </w:rPr>
       </w:pPr>
+      <w:r>
+        <w:rPr>
+          <w:rFonts w:ascii="Times New Roman" w:hAnsi="Times New Roman" w:cs="Times New Roman"/>
+          <w:color w:val="000000" w:themeColor="text1"/>
+        </w:rPr>
+        <w:t>+</w:t>
+      </w:r>
       <w:proofErr w:type="spellStart"/>
       <w:r>
         <w:rPr>
@@ -1396,6 +1569,13 @@
           <w:color w:val="000000" w:themeColor="text1"/>
         </w:rPr>
       </w:pPr>
+      <w:r>
+        <w:rPr>
+          <w:rFonts w:ascii="Times New Roman" w:hAnsi="Times New Roman" w:cs="Times New Roman"/>
+          <w:color w:val="000000" w:themeColor="text1"/>
+        </w:rPr>
+        <w:t>+</w:t>
+      </w:r>
       <w:proofErr w:type="spellStart"/>
       <w:r>
         <w:rPr>
@@ -1428,6 +1608,13 @@
           <w:color w:val="000000" w:themeColor="text1"/>
         </w:rPr>
       </w:pPr>
+      <w:r>
+        <w:rPr>
+          <w:rFonts w:ascii="Times New Roman" w:hAnsi="Times New Roman" w:cs="Times New Roman"/>
+          <w:color w:val="000000" w:themeColor="text1"/>
+        </w:rPr>
+        <w:t>+</w:t>
+      </w:r>
       <w:proofErr w:type="spellStart"/>
       <w:r>
         <w:rPr>
@@ -1492,6 +1679,13 @@
           <w:rFonts w:ascii="Times New Roman" w:hAnsi="Times New Roman" w:cs="Times New Roman"/>
           <w:color w:val="000000" w:themeColor="text1"/>
         </w:rPr>
+        <w:t>#</w:t>
+      </w:r>
+      <w:r>
+        <w:rPr>
+          <w:rFonts w:ascii="Times New Roman" w:hAnsi="Times New Roman" w:cs="Times New Roman"/>
+          <w:color w:val="000000" w:themeColor="text1"/>
+        </w:rPr>
         <w:t>id: string</w:t>
       </w:r>
     </w:p>
@@ -1515,6 +1709,13 @@
           <w:rFonts w:ascii="Times New Roman" w:hAnsi="Times New Roman" w:cs="Times New Roman"/>
           <w:color w:val="000000" w:themeColor="text1"/>
         </w:rPr>
+        <w:t>#</w:t>
+      </w:r>
+      <w:r>
+        <w:rPr>
+          <w:rFonts w:ascii="Times New Roman" w:hAnsi="Times New Roman" w:cs="Times New Roman"/>
+          <w:color w:val="000000" w:themeColor="text1"/>
+        </w:rPr>
         <w:t>student: Student</w:t>
       </w:r>
     </w:p>
@@ -1533,21 +1734,19 @@
           <w:color w:val="000000" w:themeColor="text1"/>
         </w:rPr>
       </w:pPr>
-      <w:proofErr w:type="spellStart"/>
-      <w:r>
-        <w:rPr>
-          <w:rFonts w:ascii="Times New Roman" w:hAnsi="Times New Roman" w:cs="Times New Roman"/>
-          <w:color w:val="000000" w:themeColor="text1"/>
-        </w:rPr>
-        <w:t>ukm</w:t>
-      </w:r>
-      <w:proofErr w:type="spellEnd"/>
-      <w:r>
-        <w:rPr>
-          <w:rFonts w:ascii="Times New Roman" w:hAnsi="Times New Roman" w:cs="Times New Roman"/>
-          <w:color w:val="000000" w:themeColor="text1"/>
-        </w:rPr>
-        <w:t>: UKM</w:t>
+      <w:r>
+        <w:rPr>
+          <w:rFonts w:ascii="Times New Roman" w:hAnsi="Times New Roman" w:cs="Times New Roman"/>
+          <w:color w:val="000000" w:themeColor="text1"/>
+        </w:rPr>
+        <w:t>#</w:t>
+      </w:r>
+      <w:r>
+        <w:rPr>
+          <w:rFonts w:ascii="Times New Roman" w:hAnsi="Times New Roman" w:cs="Times New Roman"/>
+          <w:color w:val="000000" w:themeColor="text1"/>
+        </w:rPr>
+        <w:t>ukm: UKM</w:t>
       </w:r>
     </w:p>
     <w:p>
@@ -1565,6 +1764,13 @@
           <w:color w:val="000000" w:themeColor="text1"/>
         </w:rPr>
       </w:pPr>
+      <w:r>
+        <w:rPr>
+          <w:rFonts w:ascii="Times New Roman" w:hAnsi="Times New Roman" w:cs="Times New Roman"/>
+          <w:color w:val="000000" w:themeColor="text1"/>
+        </w:rPr>
+        <w:t>+</w:t>
+      </w:r>
       <w:proofErr w:type="spellStart"/>
       <w:r>
         <w:rPr>
@@ -1627,6 +1833,13 @@
           <w:rFonts w:ascii="Times New Roman" w:hAnsi="Times New Roman" w:cs="Times New Roman"/>
           <w:color w:val="000000" w:themeColor="text1"/>
         </w:rPr>
+        <w:t>#</w:t>
+      </w:r>
+      <w:r>
+        <w:rPr>
+          <w:rFonts w:ascii="Times New Roman" w:hAnsi="Times New Roman" w:cs="Times New Roman"/>
+          <w:color w:val="000000" w:themeColor="text1"/>
+        </w:rPr>
         <w:t>id: string</w:t>
       </w:r>
     </w:p>
@@ -1650,6 +1863,13 @@
           <w:rFonts w:ascii="Times New Roman" w:hAnsi="Times New Roman" w:cs="Times New Roman"/>
           <w:color w:val="000000" w:themeColor="text1"/>
         </w:rPr>
+        <w:t>#</w:t>
+      </w:r>
+      <w:r>
+        <w:rPr>
+          <w:rFonts w:ascii="Times New Roman" w:hAnsi="Times New Roman" w:cs="Times New Roman"/>
+          <w:color w:val="000000" w:themeColor="text1"/>
+        </w:rPr>
         <w:t>name: string</w:t>
       </w:r>
     </w:p>
@@ -1673,7 +1893,21 @@
           <w:rFonts w:ascii="Times New Roman" w:hAnsi="Times New Roman" w:cs="Times New Roman"/>
           <w:color w:val="000000" w:themeColor="text1"/>
         </w:rPr>
-        <w:t>weight: string</w:t>
+        <w:t>#</w:t>
+      </w:r>
+      <w:r>
+        <w:rPr>
+          <w:rFonts w:ascii="Times New Roman" w:hAnsi="Times New Roman" w:cs="Times New Roman"/>
+          <w:color w:val="000000" w:themeColor="text1"/>
+        </w:rPr>
+        <w:t xml:space="preserve">weight: </w:t>
+      </w:r>
+      <w:r>
+        <w:rPr>
+          <w:rFonts w:ascii="Times New Roman" w:hAnsi="Times New Roman" w:cs="Times New Roman"/>
+          <w:color w:val="000000" w:themeColor="text1"/>
+        </w:rPr>
+        <w:t>float</w:t>
       </w:r>
     </w:p>
     <w:p>
@@ -1691,6 +1925,13 @@
           <w:color w:val="000000" w:themeColor="text1"/>
         </w:rPr>
       </w:pPr>
+      <w:r>
+        <w:rPr>
+          <w:rFonts w:ascii="Times New Roman" w:hAnsi="Times New Roman" w:cs="Times New Roman"/>
+          <w:color w:val="000000" w:themeColor="text1"/>
+        </w:rPr>
+        <w:t>+</w:t>
+      </w:r>
       <w:proofErr w:type="spellStart"/>
       <w:r>
         <w:rPr>
@@ -1723,6 +1964,13 @@
           <w:color w:val="000000" w:themeColor="text1"/>
         </w:rPr>
       </w:pPr>
+      <w:r>
+        <w:rPr>
+          <w:rFonts w:ascii="Times New Roman" w:hAnsi="Times New Roman" w:cs="Times New Roman"/>
+          <w:color w:val="000000" w:themeColor="text1"/>
+        </w:rPr>
+        <w:t>+</w:t>
+      </w:r>
       <w:proofErr w:type="spellStart"/>
       <w:r>
         <w:rPr>
@@ -1755,6 +2003,13 @@
           <w:color w:val="000000" w:themeColor="text1"/>
         </w:rPr>
       </w:pPr>
+      <w:r>
+        <w:rPr>
+          <w:rFonts w:ascii="Times New Roman" w:hAnsi="Times New Roman" w:cs="Times New Roman"/>
+          <w:color w:val="000000" w:themeColor="text1"/>
+        </w:rPr>
+        <w:t>+</w:t>
+      </w:r>
       <w:proofErr w:type="spellStart"/>
       <w:r>
         <w:rPr>
@@ -1786,147 +2041,13 @@
           <w:bCs/>
           <w:color w:val="000000" w:themeColor="text1"/>
         </w:rPr>
-      </w:pPr>
-      <w:r>
-        <w:rPr>
-          <w:rFonts w:ascii="Times New Roman" w:hAnsi="Times New Roman" w:cs="Times New Roman"/>
-          <w:b/>
-          <w:bCs/>
-          <w:color w:val="000000" w:themeColor="text1"/>
-        </w:rPr>
-        <w:t>Assessment</w:t>
-      </w:r>
-    </w:p>
-    <w:p>
-      <w:pPr>
-        <w:pStyle w:val="ListParagraph"/>
-        <w:numPr>
-          <w:ilvl w:val="1"/>
-          <w:numId w:val="5"/>
-        </w:numPr>
-        <w:spacing w:line="360" w:lineRule="auto"/>
-        <w:rPr>
-          <w:rFonts w:ascii="Times New Roman" w:hAnsi="Times New Roman" w:cs="Times New Roman"/>
-          <w:color w:val="000000" w:themeColor="text1"/>
-        </w:rPr>
-      </w:pPr>
-      <w:r>
-        <w:rPr>
-          <w:rFonts w:ascii="Times New Roman" w:hAnsi="Times New Roman" w:cs="Times New Roman"/>
-          <w:color w:val="000000" w:themeColor="text1"/>
-        </w:rPr>
-        <w:t>id:</w:t>
-      </w:r>
-      <w:r>
-        <w:rPr>
-          <w:rFonts w:ascii="Times New Roman" w:hAnsi="Times New Roman" w:cs="Times New Roman"/>
-          <w:color w:val="000000" w:themeColor="text1"/>
-        </w:rPr>
-        <w:t xml:space="preserve"> string</w:t>
-      </w:r>
-    </w:p>
-    <w:p>
-      <w:pPr>
-        <w:pStyle w:val="ListParagraph"/>
-        <w:numPr>
-          <w:ilvl w:val="1"/>
-          <w:numId w:val="5"/>
-        </w:numPr>
-        <w:spacing w:line="360" w:lineRule="auto"/>
-        <w:rPr>
-          <w:rFonts w:ascii="Times New Roman" w:hAnsi="Times New Roman" w:cs="Times New Roman"/>
-          <w:color w:val="000000" w:themeColor="text1"/>
-        </w:rPr>
-      </w:pPr>
-      <w:r>
-        <w:rPr>
-          <w:rFonts w:ascii="Times New Roman" w:hAnsi="Times New Roman" w:cs="Times New Roman"/>
-          <w:color w:val="000000" w:themeColor="text1"/>
-        </w:rPr>
-        <w:t>name: string</w:t>
-      </w:r>
-    </w:p>
-    <w:p>
-      <w:pPr>
-        <w:pStyle w:val="ListParagraph"/>
-        <w:numPr>
-          <w:ilvl w:val="1"/>
-          <w:numId w:val="5"/>
-        </w:numPr>
-        <w:spacing w:line="360" w:lineRule="auto"/>
-        <w:rPr>
-          <w:rFonts w:ascii="Times New Roman" w:hAnsi="Times New Roman" w:cs="Times New Roman"/>
-          <w:color w:val="000000" w:themeColor="text1"/>
-        </w:rPr>
-      </w:pPr>
-      <w:r>
-        <w:rPr>
-          <w:rFonts w:ascii="Times New Roman" w:hAnsi="Times New Roman" w:cs="Times New Roman"/>
-          <w:color w:val="000000" w:themeColor="text1"/>
-        </w:rPr>
-        <w:lastRenderedPageBreak/>
-        <w:t>score: float</w:t>
-      </w:r>
-    </w:p>
-    <w:p>
-      <w:pPr>
-        <w:pStyle w:val="ListParagraph"/>
-        <w:numPr>
-          <w:ilvl w:val="1"/>
-          <w:numId w:val="5"/>
-        </w:numPr>
-        <w:spacing w:line="360" w:lineRule="auto"/>
-        <w:rPr>
-          <w:rFonts w:ascii="Times New Roman" w:hAnsi="Times New Roman" w:cs="Times New Roman"/>
-          <w:color w:val="000000" w:themeColor="text1"/>
-        </w:rPr>
-      </w:pPr>
-      <w:proofErr w:type="spellStart"/>
-      <w:r>
-        <w:rPr>
-          <w:rFonts w:ascii="Times New Roman" w:hAnsi="Times New Roman" w:cs="Times New Roman"/>
-          <w:color w:val="000000" w:themeColor="text1"/>
-        </w:rPr>
-        <w:t>getStudentAssessments</w:t>
-      </w:r>
-      <w:proofErr w:type="spellEnd"/>
-      <w:r>
-        <w:rPr>
-          <w:rFonts w:ascii="Times New Roman" w:hAnsi="Times New Roman" w:cs="Times New Roman"/>
-          <w:color w:val="000000" w:themeColor="text1"/>
-        </w:rPr>
-        <w:t>(student)</w:t>
-      </w:r>
-    </w:p>
-    <w:p>
-      <w:pPr>
-        <w:pStyle w:val="ListParagraph"/>
-        <w:numPr>
-          <w:ilvl w:val="1"/>
-          <w:numId w:val="5"/>
-        </w:numPr>
-        <w:spacing w:line="360" w:lineRule="auto"/>
-        <w:rPr>
-          <w:rFonts w:ascii="Times New Roman" w:hAnsi="Times New Roman" w:cs="Times New Roman"/>
-          <w:color w:val="000000" w:themeColor="text1"/>
-        </w:rPr>
-      </w:pPr>
-      <w:proofErr w:type="spellStart"/>
-      <w:r>
-        <w:rPr>
-          <w:rFonts w:ascii="Times New Roman" w:hAnsi="Times New Roman" w:cs="Times New Roman"/>
-          <w:color w:val="000000" w:themeColor="text1"/>
-        </w:rPr>
-        <w:t>getStudentRecommendation</w:t>
-      </w:r>
-      <w:proofErr w:type="spellEnd"/>
-      <w:r>
-        <w:rPr>
-          <w:rFonts w:ascii="Times New Roman" w:hAnsi="Times New Roman" w:cs="Times New Roman"/>
-          <w:color w:val="000000" w:themeColor="text1"/>
-        </w:rPr>
-        <w:t>(student)</w:t>
-      </w:r>
+        <w:sectPr>
+          <w:pgSz w:w="12240" w:h="15840"/>
+          <w:pgMar w:top="1440" w:right="1440" w:bottom="1440" w:left="1440" w:header="708" w:footer="708" w:gutter="0"/>
+          <w:cols w:space="708"/>
+          <w:docGrid w:linePitch="360"/>
+        </w:sectPr>
+      </w:pPr>
     </w:p>
     <w:p>
       <w:pPr>
@@ -1950,7 +2071,8 @@
           <w:bCs/>
           <w:color w:val="000000" w:themeColor="text1"/>
         </w:rPr>
-        <w:t>Recommendation</w:t>
+        <w:lastRenderedPageBreak/>
+        <w:t>Assessment</w:t>
       </w:r>
     </w:p>
     <w:p>
@@ -1963,17 +2085,159 @@
         <w:spacing w:line="360" w:lineRule="auto"/>
         <w:rPr>
           <w:rFonts w:ascii="Times New Roman" w:hAnsi="Times New Roman" w:cs="Times New Roman"/>
-          <w:b/>
-          <w:bCs/>
-          <w:color w:val="000000" w:themeColor="text1"/>
-        </w:rPr>
-      </w:pPr>
-      <w:r>
-        <w:rPr>
-          <w:rFonts w:ascii="Times New Roman" w:hAnsi="Times New Roman" w:cs="Times New Roman"/>
-          <w:color w:val="000000" w:themeColor="text1"/>
-        </w:rPr>
-        <w:t>id: string</w:t>
+          <w:color w:val="000000" w:themeColor="text1"/>
+        </w:rPr>
+      </w:pPr>
+      <w:r>
+        <w:rPr>
+          <w:rFonts w:ascii="Times New Roman" w:hAnsi="Times New Roman" w:cs="Times New Roman"/>
+          <w:color w:val="000000" w:themeColor="text1"/>
+        </w:rPr>
+        <w:t>#</w:t>
+      </w:r>
+      <w:r>
+        <w:rPr>
+          <w:rFonts w:ascii="Times New Roman" w:hAnsi="Times New Roman" w:cs="Times New Roman"/>
+          <w:color w:val="000000" w:themeColor="text1"/>
+        </w:rPr>
+        <w:t>id:</w:t>
+      </w:r>
+      <w:r>
+        <w:rPr>
+          <w:rFonts w:ascii="Times New Roman" w:hAnsi="Times New Roman" w:cs="Times New Roman"/>
+          <w:color w:val="000000" w:themeColor="text1"/>
+        </w:rPr>
+        <w:t xml:space="preserve"> string</w:t>
+      </w:r>
+    </w:p>
+    <w:p>
+      <w:pPr>
+        <w:pStyle w:val="ListParagraph"/>
+        <w:numPr>
+          <w:ilvl w:val="1"/>
+          <w:numId w:val="5"/>
+        </w:numPr>
+        <w:spacing w:line="360" w:lineRule="auto"/>
+        <w:rPr>
+          <w:rFonts w:ascii="Times New Roman" w:hAnsi="Times New Roman" w:cs="Times New Roman"/>
+          <w:color w:val="000000" w:themeColor="text1"/>
+        </w:rPr>
+      </w:pPr>
+      <w:r>
+        <w:rPr>
+          <w:rFonts w:ascii="Times New Roman" w:hAnsi="Times New Roman" w:cs="Times New Roman"/>
+          <w:color w:val="000000" w:themeColor="text1"/>
+        </w:rPr>
+        <w:t>#</w:t>
+      </w:r>
+      <w:r>
+        <w:rPr>
+          <w:rFonts w:ascii="Times New Roman" w:hAnsi="Times New Roman" w:cs="Times New Roman"/>
+          <w:color w:val="000000" w:themeColor="text1"/>
+        </w:rPr>
+        <w:t>name: string</w:t>
+      </w:r>
+    </w:p>
+    <w:p>
+      <w:pPr>
+        <w:pStyle w:val="ListParagraph"/>
+        <w:numPr>
+          <w:ilvl w:val="1"/>
+          <w:numId w:val="5"/>
+        </w:numPr>
+        <w:spacing w:line="360" w:lineRule="auto"/>
+        <w:rPr>
+          <w:rFonts w:ascii="Times New Roman" w:hAnsi="Times New Roman" w:cs="Times New Roman"/>
+          <w:color w:val="000000" w:themeColor="text1"/>
+        </w:rPr>
+      </w:pPr>
+      <w:r>
+        <w:rPr>
+          <w:rFonts w:ascii="Times New Roman" w:hAnsi="Times New Roman" w:cs="Times New Roman"/>
+          <w:color w:val="000000" w:themeColor="text1"/>
+        </w:rPr>
+        <w:t>#</w:t>
+      </w:r>
+      <w:r>
+        <w:rPr>
+          <w:rFonts w:ascii="Times New Roman" w:hAnsi="Times New Roman" w:cs="Times New Roman"/>
+          <w:color w:val="000000" w:themeColor="text1"/>
+        </w:rPr>
+        <w:t>score: float</w:t>
+      </w:r>
+    </w:p>
+    <w:p>
+      <w:pPr>
+        <w:pStyle w:val="ListParagraph"/>
+        <w:numPr>
+          <w:ilvl w:val="1"/>
+          <w:numId w:val="5"/>
+        </w:numPr>
+        <w:spacing w:line="360" w:lineRule="auto"/>
+        <w:rPr>
+          <w:rFonts w:ascii="Times New Roman" w:hAnsi="Times New Roman" w:cs="Times New Roman"/>
+          <w:color w:val="000000" w:themeColor="text1"/>
+        </w:rPr>
+      </w:pPr>
+      <w:r>
+        <w:rPr>
+          <w:rFonts w:ascii="Times New Roman" w:hAnsi="Times New Roman" w:cs="Times New Roman"/>
+          <w:color w:val="000000" w:themeColor="text1"/>
+        </w:rPr>
+        <w:t>+</w:t>
+      </w:r>
+      <w:proofErr w:type="spellStart"/>
+      <w:r>
+        <w:rPr>
+          <w:rFonts w:ascii="Times New Roman" w:hAnsi="Times New Roman" w:cs="Times New Roman"/>
+          <w:color w:val="000000" w:themeColor="text1"/>
+        </w:rPr>
+        <w:t>getStudentAssessments</w:t>
+      </w:r>
+      <w:proofErr w:type="spellEnd"/>
+      <w:r>
+        <w:rPr>
+          <w:rFonts w:ascii="Times New Roman" w:hAnsi="Times New Roman" w:cs="Times New Roman"/>
+          <w:color w:val="000000" w:themeColor="text1"/>
+        </w:rPr>
+        <w:t>(student)</w:t>
+      </w:r>
+    </w:p>
+    <w:p>
+      <w:pPr>
+        <w:pStyle w:val="ListParagraph"/>
+        <w:numPr>
+          <w:ilvl w:val="1"/>
+          <w:numId w:val="5"/>
+        </w:numPr>
+        <w:spacing w:line="360" w:lineRule="auto"/>
+        <w:rPr>
+          <w:rFonts w:ascii="Times New Roman" w:hAnsi="Times New Roman" w:cs="Times New Roman"/>
+          <w:color w:val="000000" w:themeColor="text1"/>
+        </w:rPr>
+      </w:pPr>
+      <w:r>
+        <w:rPr>
+          <w:rFonts w:ascii="Times New Roman" w:hAnsi="Times New Roman" w:cs="Times New Roman"/>
+          <w:color w:val="000000" w:themeColor="text1"/>
+        </w:rPr>
+        <w:t>+</w:t>
+      </w:r>
+      <w:proofErr w:type="spellStart"/>
+      <w:r>
+        <w:rPr>
+          <w:rFonts w:ascii="Times New Roman" w:hAnsi="Times New Roman" w:cs="Times New Roman"/>
+          <w:color w:val="000000" w:themeColor="text1"/>
+        </w:rPr>
+        <w:t>getStudentRecommendation</w:t>
+      </w:r>
+      <w:proofErr w:type="spellEnd"/>
+      <w:r>
+        <w:rPr>
+          <w:rFonts w:ascii="Times New Roman" w:hAnsi="Times New Roman" w:cs="Times New Roman"/>
+          <w:color w:val="000000" w:themeColor="text1"/>
+        </w:rPr>
+        <w:t>(student)</w:t>
       </w:r>
     </w:p>
     <w:p>
@@ -1991,6 +2255,84 @@
           <w:color w:val="000000" w:themeColor="text1"/>
         </w:rPr>
       </w:pPr>
+      <w:r>
+        <w:rPr>
+          <w:rFonts w:ascii="Times New Roman" w:hAnsi="Times New Roman" w:cs="Times New Roman"/>
+          <w:b/>
+          <w:bCs/>
+          <w:color w:val="000000" w:themeColor="text1"/>
+        </w:rPr>
+        <w:t>Recommendation</w:t>
+      </w:r>
+    </w:p>
+    <w:p>
+      <w:pPr>
+        <w:pStyle w:val="ListParagraph"/>
+        <w:numPr>
+          <w:ilvl w:val="1"/>
+          <w:numId w:val="5"/>
+        </w:numPr>
+        <w:spacing w:line="360" w:lineRule="auto"/>
+        <w:rPr>
+          <w:rFonts w:ascii="Times New Roman" w:hAnsi="Times New Roman" w:cs="Times New Roman"/>
+          <w:b/>
+          <w:bCs/>
+          <w:color w:val="000000" w:themeColor="text1"/>
+        </w:rPr>
+      </w:pPr>
+      <w:r>
+        <w:rPr>
+          <w:rFonts w:ascii="Times New Roman" w:hAnsi="Times New Roman" w:cs="Times New Roman"/>
+          <w:color w:val="000000" w:themeColor="text1"/>
+        </w:rPr>
+        <w:t>#</w:t>
+      </w:r>
+      <w:r>
+        <w:rPr>
+          <w:rFonts w:ascii="Times New Roman" w:hAnsi="Times New Roman" w:cs="Times New Roman"/>
+          <w:color w:val="000000" w:themeColor="text1"/>
+        </w:rPr>
+        <w:t>id: string</w:t>
+      </w:r>
+    </w:p>
+    <w:p>
+      <w:pPr>
+        <w:pStyle w:val="ListParagraph"/>
+        <w:numPr>
+          <w:ilvl w:val="1"/>
+          <w:numId w:val="5"/>
+        </w:numPr>
+        <w:spacing w:line="360" w:lineRule="auto"/>
+        <w:rPr>
+          <w:rFonts w:ascii="Times New Roman" w:hAnsi="Times New Roman" w:cs="Times New Roman"/>
+          <w:b/>
+          <w:bCs/>
+          <w:color w:val="000000" w:themeColor="text1"/>
+        </w:rPr>
+      </w:pPr>
+      <w:r>
+        <w:rPr>
+          <w:rFonts w:ascii="Times New Roman" w:hAnsi="Times New Roman" w:cs="Times New Roman"/>
+          <w:color w:val="000000" w:themeColor="text1"/>
+        </w:rPr>
+        <w:t>#ukm: UKM</w:t>
+      </w:r>
+    </w:p>
+    <w:p>
+      <w:pPr>
+        <w:pStyle w:val="ListParagraph"/>
+        <w:numPr>
+          <w:ilvl w:val="0"/>
+          <w:numId w:val="5"/>
+        </w:numPr>
+        <w:spacing w:line="360" w:lineRule="auto"/>
+        <w:rPr>
+          <w:rFonts w:ascii="Times New Roman" w:hAnsi="Times New Roman" w:cs="Times New Roman"/>
+          <w:b/>
+          <w:bCs/>
+          <w:color w:val="000000" w:themeColor="text1"/>
+        </w:rPr>
+      </w:pPr>
       <w:proofErr w:type="spellStart"/>
       <w:r>
         <w:rPr>
@@ -2013,15 +2355,40 @@
         <w:spacing w:line="360" w:lineRule="auto"/>
         <w:rPr>
           <w:rFonts w:ascii="Times New Roman" w:hAnsi="Times New Roman" w:cs="Times New Roman"/>
-          <w:color w:val="000000" w:themeColor="text1"/>
-        </w:rPr>
-      </w:pPr>
-      <w:r>
-        <w:rPr>
-          <w:rFonts w:ascii="Times New Roman" w:hAnsi="Times New Roman" w:cs="Times New Roman"/>
-          <w:color w:val="000000" w:themeColor="text1"/>
-        </w:rPr>
-        <w:t>weight: float</w:t>
+          <w:b/>
+          <w:bCs/>
+          <w:color w:val="000000" w:themeColor="text1"/>
+        </w:rPr>
+      </w:pPr>
+      <w:r>
+        <w:rPr>
+          <w:rFonts w:ascii="Times New Roman" w:hAnsi="Times New Roman" w:cs="Times New Roman"/>
+          <w:color w:val="000000" w:themeColor="text1"/>
+        </w:rPr>
+        <w:t>#ukm: UKM</w:t>
+      </w:r>
+    </w:p>
+    <w:p>
+      <w:pPr>
+        <w:pStyle w:val="ListParagraph"/>
+        <w:numPr>
+          <w:ilvl w:val="1"/>
+          <w:numId w:val="5"/>
+        </w:numPr>
+        <w:spacing w:line="360" w:lineRule="auto"/>
+        <w:rPr>
+          <w:rFonts w:ascii="Times New Roman" w:hAnsi="Times New Roman" w:cs="Times New Roman"/>
+          <w:b/>
+          <w:bCs/>
+          <w:color w:val="000000" w:themeColor="text1"/>
+        </w:rPr>
+      </w:pPr>
+      <w:r>
+        <w:rPr>
+          <w:rFonts w:ascii="Times New Roman" w:hAnsi="Times New Roman" w:cs="Times New Roman"/>
+          <w:color w:val="000000" w:themeColor="text1"/>
+        </w:rPr>
+        <w:t>#criteria: Criteria</w:t>
       </w:r>
     </w:p>
     <w:p>
@@ -2072,9 +2439,1467 @@
         <w:spacing w:line="360" w:lineRule="auto"/>
         <w:rPr>
           <w:rFonts w:ascii="Times New Roman" w:hAnsi="Times New Roman" w:cs="Times New Roman"/>
-          <w:color w:val="000000" w:themeColor="text1"/>
-        </w:rPr>
-      </w:pPr>
+          <w:b/>
+          <w:bCs/>
+          <w:color w:val="000000" w:themeColor="text1"/>
+        </w:rPr>
+      </w:pPr>
+      <w:r>
+        <w:rPr>
+          <w:rFonts w:ascii="Times New Roman" w:hAnsi="Times New Roman" w:cs="Times New Roman"/>
+          <w:b/>
+          <w:bCs/>
+          <w:color w:val="000000" w:themeColor="text1"/>
+        </w:rPr>
+        <w:t>Department – Class</w:t>
+      </w:r>
+    </w:p>
+    <w:p>
+      <w:pPr>
+        <w:pStyle w:val="ListParagraph"/>
+        <w:numPr>
+          <w:ilvl w:val="1"/>
+          <w:numId w:val="4"/>
+        </w:numPr>
+        <w:spacing w:line="360" w:lineRule="auto"/>
+        <w:rPr>
+          <w:rFonts w:ascii="Times New Roman" w:hAnsi="Times New Roman" w:cs="Times New Roman"/>
+          <w:color w:val="000000" w:themeColor="text1"/>
+        </w:rPr>
+      </w:pPr>
+      <w:r>
+        <w:rPr>
+          <w:rFonts w:ascii="Times New Roman" w:hAnsi="Times New Roman" w:cs="Times New Roman"/>
+          <w:b/>
+          <w:bCs/>
+          <w:color w:val="000000" w:themeColor="text1"/>
+        </w:rPr>
+        <w:t>Relations</w:t>
+      </w:r>
+      <w:r>
+        <w:rPr>
+          <w:rFonts w:ascii="Times New Roman" w:hAnsi="Times New Roman" w:cs="Times New Roman"/>
+          <w:color w:val="000000" w:themeColor="text1"/>
+        </w:rPr>
+        <w:t>: Composition (1-to-Many)</w:t>
+      </w:r>
+    </w:p>
+    <w:p>
+      <w:pPr>
+        <w:pStyle w:val="ListParagraph"/>
+        <w:numPr>
+          <w:ilvl w:val="1"/>
+          <w:numId w:val="4"/>
+        </w:numPr>
+        <w:spacing w:line="360" w:lineRule="auto"/>
+        <w:rPr>
+          <w:rFonts w:ascii="Times New Roman" w:hAnsi="Times New Roman" w:cs="Times New Roman"/>
+          <w:color w:val="000000" w:themeColor="text1"/>
+        </w:rPr>
+      </w:pPr>
+      <w:r>
+        <w:rPr>
+          <w:rFonts w:ascii="Times New Roman" w:hAnsi="Times New Roman" w:cs="Times New Roman"/>
+          <w:b/>
+          <w:bCs/>
+          <w:color w:val="000000" w:themeColor="text1"/>
+        </w:rPr>
+        <w:t>Explanation</w:t>
+      </w:r>
+      <w:r>
+        <w:rPr>
+          <w:rFonts w:ascii="Times New Roman" w:hAnsi="Times New Roman" w:cs="Times New Roman"/>
+          <w:b/>
+          <w:bCs/>
+          <w:color w:val="000000" w:themeColor="text1"/>
+        </w:rPr>
+        <w:t>s</w:t>
+      </w:r>
+      <w:r>
+        <w:rPr>
+          <w:rFonts w:ascii="Times New Roman" w:hAnsi="Times New Roman" w:cs="Times New Roman"/>
+          <w:color w:val="000000" w:themeColor="text1"/>
+        </w:rPr>
+        <w:t>: 1 Department has many Class, but Class can’t exist without Department.</w:t>
+      </w:r>
+    </w:p>
+    <w:p>
+      <w:pPr>
+        <w:pStyle w:val="ListParagraph"/>
+        <w:numPr>
+          <w:ilvl w:val="0"/>
+          <w:numId w:val="4"/>
+        </w:numPr>
+        <w:spacing w:line="360" w:lineRule="auto"/>
+        <w:rPr>
+          <w:rFonts w:ascii="Times New Roman" w:hAnsi="Times New Roman" w:cs="Times New Roman"/>
+          <w:b/>
+          <w:bCs/>
+          <w:color w:val="000000" w:themeColor="text1"/>
+        </w:rPr>
+      </w:pPr>
+      <w:r>
+        <w:rPr>
+          <w:rFonts w:ascii="Times New Roman" w:hAnsi="Times New Roman" w:cs="Times New Roman"/>
+          <w:b/>
+          <w:bCs/>
+          <w:color w:val="000000" w:themeColor="text1"/>
+        </w:rPr>
+        <w:t>Class – Student</w:t>
+      </w:r>
+    </w:p>
+    <w:p>
+      <w:pPr>
+        <w:pStyle w:val="ListParagraph"/>
+        <w:numPr>
+          <w:ilvl w:val="1"/>
+          <w:numId w:val="4"/>
+        </w:numPr>
+        <w:spacing w:line="360" w:lineRule="auto"/>
+        <w:rPr>
+          <w:rFonts w:ascii="Times New Roman" w:hAnsi="Times New Roman" w:cs="Times New Roman"/>
+          <w:color w:val="000000" w:themeColor="text1"/>
+        </w:rPr>
+      </w:pPr>
+      <w:r>
+        <w:rPr>
+          <w:rFonts w:ascii="Times New Roman" w:hAnsi="Times New Roman" w:cs="Times New Roman"/>
+          <w:b/>
+          <w:bCs/>
+          <w:color w:val="000000" w:themeColor="text1"/>
+        </w:rPr>
+        <w:t>Relations</w:t>
+      </w:r>
+      <w:r>
+        <w:rPr>
+          <w:rFonts w:ascii="Times New Roman" w:hAnsi="Times New Roman" w:cs="Times New Roman"/>
+          <w:color w:val="000000" w:themeColor="text1"/>
+        </w:rPr>
+        <w:t>: Association (1-to-Many)</w:t>
+      </w:r>
+    </w:p>
+    <w:p>
+      <w:pPr>
+        <w:pStyle w:val="ListParagraph"/>
+        <w:numPr>
+          <w:ilvl w:val="1"/>
+          <w:numId w:val="4"/>
+        </w:numPr>
+        <w:spacing w:line="360" w:lineRule="auto"/>
+        <w:rPr>
+          <w:rFonts w:ascii="Times New Roman" w:hAnsi="Times New Roman" w:cs="Times New Roman"/>
+          <w:color w:val="000000" w:themeColor="text1"/>
+        </w:rPr>
+      </w:pPr>
+      <w:r>
+        <w:rPr>
+          <w:rFonts w:ascii="Times New Roman" w:hAnsi="Times New Roman" w:cs="Times New Roman"/>
+          <w:b/>
+          <w:bCs/>
+          <w:color w:val="000000" w:themeColor="text1"/>
+        </w:rPr>
+        <w:t>Explanations</w:t>
+      </w:r>
+      <w:r>
+        <w:rPr>
+          <w:rFonts w:ascii="Times New Roman" w:hAnsi="Times New Roman" w:cs="Times New Roman"/>
+          <w:color w:val="000000" w:themeColor="text1"/>
+        </w:rPr>
+        <w:t>:</w:t>
+      </w:r>
+      <w:r>
+        <w:rPr>
+          <w:rFonts w:ascii="Times New Roman" w:hAnsi="Times New Roman" w:cs="Times New Roman"/>
+          <w:color w:val="000000" w:themeColor="text1"/>
+        </w:rPr>
+        <w:t xml:space="preserve"> 1 Class can accommodate many Student, and Student must registered on 1 Class</w:t>
+      </w:r>
+      <w:r>
+        <w:rPr>
+          <w:rFonts w:ascii="Times New Roman" w:hAnsi="Times New Roman" w:cs="Times New Roman"/>
+          <w:color w:val="000000" w:themeColor="text1"/>
+        </w:rPr>
+        <w:t>.</w:t>
+      </w:r>
+    </w:p>
+    <w:p>
+      <w:pPr>
+        <w:pStyle w:val="ListParagraph"/>
+        <w:numPr>
+          <w:ilvl w:val="0"/>
+          <w:numId w:val="4"/>
+        </w:numPr>
+        <w:spacing w:line="360" w:lineRule="auto"/>
+        <w:rPr>
+          <w:rFonts w:ascii="Times New Roman" w:hAnsi="Times New Roman" w:cs="Times New Roman"/>
+          <w:b/>
+          <w:bCs/>
+          <w:color w:val="000000" w:themeColor="text1"/>
+        </w:rPr>
+      </w:pPr>
+      <w:r>
+        <w:rPr>
+          <w:rFonts w:ascii="Times New Roman" w:hAnsi="Times New Roman" w:cs="Times New Roman"/>
+          <w:b/>
+          <w:bCs/>
+          <w:color w:val="000000" w:themeColor="text1"/>
+        </w:rPr>
+        <w:t xml:space="preserve">Student – </w:t>
+      </w:r>
+      <w:proofErr w:type="spellStart"/>
+      <w:r>
+        <w:rPr>
+          <w:rFonts w:ascii="Times New Roman" w:hAnsi="Times New Roman" w:cs="Times New Roman"/>
+          <w:b/>
+          <w:bCs/>
+          <w:color w:val="000000" w:themeColor="text1"/>
+        </w:rPr>
+        <w:t>StudentUKM</w:t>
+      </w:r>
+      <w:proofErr w:type="spellEnd"/>
+    </w:p>
+    <w:p>
+      <w:pPr>
+        <w:pStyle w:val="ListParagraph"/>
+        <w:numPr>
+          <w:ilvl w:val="1"/>
+          <w:numId w:val="4"/>
+        </w:numPr>
+        <w:spacing w:line="360" w:lineRule="auto"/>
+        <w:rPr>
+          <w:rFonts w:ascii="Times New Roman" w:hAnsi="Times New Roman" w:cs="Times New Roman"/>
+          <w:color w:val="000000" w:themeColor="text1"/>
+        </w:rPr>
+      </w:pPr>
+      <w:r>
+        <w:rPr>
+          <w:rFonts w:ascii="Times New Roman" w:hAnsi="Times New Roman" w:cs="Times New Roman"/>
+          <w:b/>
+          <w:bCs/>
+          <w:color w:val="000000" w:themeColor="text1"/>
+        </w:rPr>
+        <w:t>Relations</w:t>
+      </w:r>
+      <w:r>
+        <w:rPr>
+          <w:rFonts w:ascii="Times New Roman" w:hAnsi="Times New Roman" w:cs="Times New Roman"/>
+          <w:color w:val="000000" w:themeColor="text1"/>
+        </w:rPr>
+        <w:t>: Aggregation (1-to-Many)</w:t>
+      </w:r>
+    </w:p>
+    <w:p>
+      <w:pPr>
+        <w:pStyle w:val="ListParagraph"/>
+        <w:numPr>
+          <w:ilvl w:val="1"/>
+          <w:numId w:val="4"/>
+        </w:numPr>
+        <w:spacing w:line="360" w:lineRule="auto"/>
+        <w:rPr>
+          <w:rFonts w:ascii="Times New Roman" w:hAnsi="Times New Roman" w:cs="Times New Roman"/>
+          <w:color w:val="000000" w:themeColor="text1"/>
+        </w:rPr>
+      </w:pPr>
+      <w:r>
+        <w:rPr>
+          <w:rFonts w:ascii="Times New Roman" w:hAnsi="Times New Roman" w:cs="Times New Roman"/>
+          <w:b/>
+          <w:bCs/>
+          <w:color w:val="000000" w:themeColor="text1"/>
+        </w:rPr>
+        <w:t>Explanations</w:t>
+      </w:r>
+      <w:r>
+        <w:rPr>
+          <w:rFonts w:ascii="Times New Roman" w:hAnsi="Times New Roman" w:cs="Times New Roman"/>
+          <w:color w:val="000000" w:themeColor="text1"/>
+        </w:rPr>
+        <w:t xml:space="preserve">: 1 Student can follows many UKM, and </w:t>
+      </w:r>
+      <w:proofErr w:type="spellStart"/>
+      <w:r>
+        <w:rPr>
+          <w:rFonts w:ascii="Times New Roman" w:hAnsi="Times New Roman" w:cs="Times New Roman"/>
+          <w:color w:val="000000" w:themeColor="text1"/>
+        </w:rPr>
+        <w:t>StudentUKM</w:t>
+      </w:r>
+      <w:proofErr w:type="spellEnd"/>
+      <w:r>
+        <w:rPr>
+          <w:rFonts w:ascii="Times New Roman" w:hAnsi="Times New Roman" w:cs="Times New Roman"/>
+          <w:color w:val="000000" w:themeColor="text1"/>
+        </w:rPr>
+        <w:t xml:space="preserve"> only connector table.</w:t>
+      </w:r>
+    </w:p>
+    <w:p>
+      <w:pPr>
+        <w:pStyle w:val="ListParagraph"/>
+        <w:numPr>
+          <w:ilvl w:val="0"/>
+          <w:numId w:val="4"/>
+        </w:numPr>
+        <w:spacing w:line="360" w:lineRule="auto"/>
+        <w:rPr>
+          <w:rFonts w:ascii="Times New Roman" w:hAnsi="Times New Roman" w:cs="Times New Roman"/>
+          <w:b/>
+          <w:bCs/>
+          <w:color w:val="000000" w:themeColor="text1"/>
+        </w:rPr>
+      </w:pPr>
+      <w:proofErr w:type="spellStart"/>
+      <w:r>
+        <w:rPr>
+          <w:rFonts w:ascii="Times New Roman" w:hAnsi="Times New Roman" w:cs="Times New Roman"/>
+          <w:b/>
+          <w:bCs/>
+          <w:color w:val="000000" w:themeColor="text1"/>
+        </w:rPr>
+        <w:t>StudentUKM</w:t>
+      </w:r>
+      <w:proofErr w:type="spellEnd"/>
+      <w:r>
+        <w:rPr>
+          <w:rFonts w:ascii="Times New Roman" w:hAnsi="Times New Roman" w:cs="Times New Roman"/>
+          <w:b/>
+          <w:bCs/>
+          <w:color w:val="000000" w:themeColor="text1"/>
+        </w:rPr>
+        <w:t xml:space="preserve"> </w:t>
+      </w:r>
+      <w:r>
+        <w:rPr>
+          <w:rFonts w:ascii="Times New Roman" w:hAnsi="Times New Roman" w:cs="Times New Roman"/>
+          <w:b/>
+          <w:bCs/>
+          <w:color w:val="000000" w:themeColor="text1"/>
+        </w:rPr>
+        <w:t>–</w:t>
+      </w:r>
+      <w:r>
+        <w:rPr>
+          <w:rFonts w:ascii="Times New Roman" w:hAnsi="Times New Roman" w:cs="Times New Roman"/>
+          <w:b/>
+          <w:bCs/>
+          <w:color w:val="000000" w:themeColor="text1"/>
+        </w:rPr>
+        <w:t xml:space="preserve"> UKM</w:t>
+      </w:r>
+    </w:p>
+    <w:p>
+      <w:pPr>
+        <w:pStyle w:val="ListParagraph"/>
+        <w:numPr>
+          <w:ilvl w:val="1"/>
+          <w:numId w:val="4"/>
+        </w:numPr>
+        <w:spacing w:line="360" w:lineRule="auto"/>
+        <w:rPr>
+          <w:rFonts w:ascii="Times New Roman" w:hAnsi="Times New Roman" w:cs="Times New Roman"/>
+          <w:b/>
+          <w:bCs/>
+          <w:color w:val="000000" w:themeColor="text1"/>
+        </w:rPr>
+      </w:pPr>
+      <w:r>
+        <w:rPr>
+          <w:rFonts w:ascii="Times New Roman" w:hAnsi="Times New Roman" w:cs="Times New Roman"/>
+          <w:b/>
+          <w:bCs/>
+          <w:color w:val="000000" w:themeColor="text1"/>
+        </w:rPr>
+        <w:t>Relations:</w:t>
+      </w:r>
+      <w:r>
+        <w:rPr>
+          <w:rFonts w:ascii="Times New Roman" w:hAnsi="Times New Roman" w:cs="Times New Roman"/>
+          <w:b/>
+          <w:bCs/>
+          <w:color w:val="000000" w:themeColor="text1"/>
+        </w:rPr>
+        <w:t xml:space="preserve"> </w:t>
+      </w:r>
+      <w:r>
+        <w:rPr>
+          <w:rFonts w:ascii="Times New Roman" w:hAnsi="Times New Roman" w:cs="Times New Roman"/>
+          <w:color w:val="000000" w:themeColor="text1"/>
+        </w:rPr>
+        <w:t>Association (Many-to-Many)</w:t>
+      </w:r>
+    </w:p>
+    <w:p>
+      <w:pPr>
+        <w:pStyle w:val="ListParagraph"/>
+        <w:numPr>
+          <w:ilvl w:val="1"/>
+          <w:numId w:val="4"/>
+        </w:numPr>
+        <w:spacing w:line="360" w:lineRule="auto"/>
+        <w:rPr>
+          <w:rFonts w:ascii="Times New Roman" w:hAnsi="Times New Roman" w:cs="Times New Roman"/>
+          <w:b/>
+          <w:bCs/>
+          <w:color w:val="000000" w:themeColor="text1"/>
+        </w:rPr>
+      </w:pPr>
+      <w:r>
+        <w:rPr>
+          <w:rFonts w:ascii="Times New Roman" w:hAnsi="Times New Roman" w:cs="Times New Roman"/>
+          <w:b/>
+          <w:bCs/>
+          <w:color w:val="000000" w:themeColor="text1"/>
+        </w:rPr>
+        <w:t>Explanations:</w:t>
+      </w:r>
+      <w:r>
+        <w:rPr>
+          <w:rFonts w:ascii="Times New Roman" w:hAnsi="Times New Roman" w:cs="Times New Roman"/>
+          <w:b/>
+          <w:bCs/>
+          <w:color w:val="000000" w:themeColor="text1"/>
+        </w:rPr>
+        <w:t xml:space="preserve"> </w:t>
+      </w:r>
+      <w:r>
+        <w:rPr>
+          <w:rFonts w:ascii="Times New Roman" w:hAnsi="Times New Roman" w:cs="Times New Roman"/>
+          <w:color w:val="000000" w:themeColor="text1"/>
+        </w:rPr>
+        <w:t>Many Student can joins with many UKM</w:t>
+      </w:r>
+      <w:r>
+        <w:rPr>
+          <w:rFonts w:ascii="Times New Roman" w:hAnsi="Times New Roman" w:cs="Times New Roman"/>
+          <w:color w:val="000000" w:themeColor="text1"/>
+        </w:rPr>
+        <w:t>.</w:t>
+      </w:r>
+    </w:p>
+    <w:p>
+      <w:pPr>
+        <w:pStyle w:val="ListParagraph"/>
+        <w:spacing w:line="360" w:lineRule="auto"/>
+        <w:rPr>
+          <w:rFonts w:ascii="Times New Roman" w:hAnsi="Times New Roman" w:cs="Times New Roman"/>
+          <w:b/>
+          <w:bCs/>
+          <w:color w:val="000000" w:themeColor="text1"/>
+        </w:rPr>
+        <w:sectPr>
+          <w:pgSz w:w="12240" w:h="15840"/>
+          <w:pgMar w:top="1440" w:right="1440" w:bottom="1440" w:left="1440" w:header="708" w:footer="708" w:gutter="0"/>
+          <w:cols w:space="708"/>
+          <w:docGrid w:linePitch="360"/>
+        </w:sectPr>
+      </w:pPr>
+    </w:p>
+    <w:p>
+      <w:pPr>
+        <w:pStyle w:val="ListParagraph"/>
+        <w:numPr>
+          <w:ilvl w:val="0"/>
+          <w:numId w:val="4"/>
+        </w:numPr>
+        <w:spacing w:line="360" w:lineRule="auto"/>
+        <w:rPr>
+          <w:rFonts w:ascii="Times New Roman" w:hAnsi="Times New Roman" w:cs="Times New Roman"/>
+          <w:b/>
+          <w:bCs/>
+          <w:color w:val="000000" w:themeColor="text1"/>
+        </w:rPr>
+      </w:pPr>
+      <w:r>
+        <w:rPr>
+          <w:rFonts w:ascii="Times New Roman" w:hAnsi="Times New Roman" w:cs="Times New Roman"/>
+          <w:b/>
+          <w:bCs/>
+          <w:color w:val="000000" w:themeColor="text1"/>
+        </w:rPr>
+        <w:lastRenderedPageBreak/>
+        <w:t>Student – Assessment</w:t>
+      </w:r>
+    </w:p>
+    <w:p>
+      <w:pPr>
+        <w:pStyle w:val="ListParagraph"/>
+        <w:numPr>
+          <w:ilvl w:val="1"/>
+          <w:numId w:val="4"/>
+        </w:numPr>
+        <w:spacing w:line="360" w:lineRule="auto"/>
+        <w:rPr>
+          <w:rFonts w:ascii="Times New Roman" w:hAnsi="Times New Roman" w:cs="Times New Roman"/>
+          <w:b/>
+          <w:bCs/>
+          <w:color w:val="000000" w:themeColor="text1"/>
+        </w:rPr>
+      </w:pPr>
+      <w:r>
+        <w:rPr>
+          <w:rFonts w:ascii="Times New Roman" w:hAnsi="Times New Roman" w:cs="Times New Roman"/>
+          <w:b/>
+          <w:bCs/>
+          <w:color w:val="000000" w:themeColor="text1"/>
+        </w:rPr>
+        <w:t>Relations:</w:t>
+      </w:r>
+      <w:r>
+        <w:rPr>
+          <w:rFonts w:ascii="Times New Roman" w:hAnsi="Times New Roman" w:cs="Times New Roman"/>
+          <w:b/>
+          <w:bCs/>
+          <w:color w:val="000000" w:themeColor="text1"/>
+        </w:rPr>
+        <w:t xml:space="preserve"> </w:t>
+      </w:r>
+      <w:r>
+        <w:rPr>
+          <w:rFonts w:ascii="Times New Roman" w:hAnsi="Times New Roman" w:cs="Times New Roman"/>
+          <w:color w:val="000000" w:themeColor="text1"/>
+        </w:rPr>
+        <w:t>Composition (1-to-Many)</w:t>
+      </w:r>
+    </w:p>
+    <w:p>
+      <w:pPr>
+        <w:pStyle w:val="ListParagraph"/>
+        <w:numPr>
+          <w:ilvl w:val="1"/>
+          <w:numId w:val="4"/>
+        </w:numPr>
+        <w:spacing w:line="360" w:lineRule="auto"/>
+        <w:rPr>
+          <w:rFonts w:ascii="Times New Roman" w:hAnsi="Times New Roman" w:cs="Times New Roman"/>
+          <w:b/>
+          <w:bCs/>
+          <w:color w:val="000000" w:themeColor="text1"/>
+        </w:rPr>
+      </w:pPr>
+      <w:r>
+        <w:rPr>
+          <w:rFonts w:ascii="Times New Roman" w:hAnsi="Times New Roman" w:cs="Times New Roman"/>
+          <w:b/>
+          <w:bCs/>
+          <w:color w:val="000000" w:themeColor="text1"/>
+        </w:rPr>
+        <w:t>Explanations:</w:t>
+      </w:r>
+      <w:r>
+        <w:rPr>
+          <w:rFonts w:ascii="Times New Roman" w:hAnsi="Times New Roman" w:cs="Times New Roman"/>
+          <w:b/>
+          <w:bCs/>
+          <w:color w:val="000000" w:themeColor="text1"/>
+        </w:rPr>
+        <w:t xml:space="preserve"> </w:t>
+      </w:r>
+      <w:r>
+        <w:rPr>
+          <w:rFonts w:ascii="Times New Roman" w:hAnsi="Times New Roman" w:cs="Times New Roman"/>
+          <w:color w:val="000000" w:themeColor="text1"/>
+        </w:rPr>
+        <w:t>1 Student has many Assessment, but Assessment can’t exist without Student</w:t>
+      </w:r>
+      <w:r>
+        <w:rPr>
+          <w:rFonts w:ascii="Times New Roman" w:hAnsi="Times New Roman" w:cs="Times New Roman"/>
+          <w:color w:val="000000" w:themeColor="text1"/>
+        </w:rPr>
+        <w:t>.</w:t>
+      </w:r>
+    </w:p>
+    <w:p>
+      <w:pPr>
+        <w:pStyle w:val="ListParagraph"/>
+        <w:numPr>
+          <w:ilvl w:val="0"/>
+          <w:numId w:val="4"/>
+        </w:numPr>
+        <w:spacing w:line="360" w:lineRule="auto"/>
+        <w:rPr>
+          <w:rFonts w:ascii="Times New Roman" w:hAnsi="Times New Roman" w:cs="Times New Roman"/>
+          <w:b/>
+          <w:bCs/>
+          <w:color w:val="000000" w:themeColor="text1"/>
+        </w:rPr>
+      </w:pPr>
+      <w:r>
+        <w:rPr>
+          <w:rFonts w:ascii="Times New Roman" w:hAnsi="Times New Roman" w:cs="Times New Roman"/>
+          <w:b/>
+          <w:bCs/>
+          <w:color w:val="000000" w:themeColor="text1"/>
+        </w:rPr>
+        <w:t>Assessment – Criteria</w:t>
+      </w:r>
+    </w:p>
+    <w:p>
+      <w:pPr>
+        <w:pStyle w:val="ListParagraph"/>
+        <w:numPr>
+          <w:ilvl w:val="1"/>
+          <w:numId w:val="4"/>
+        </w:numPr>
+        <w:spacing w:line="360" w:lineRule="auto"/>
+        <w:rPr>
+          <w:rFonts w:ascii="Times New Roman" w:hAnsi="Times New Roman" w:cs="Times New Roman"/>
+          <w:b/>
+          <w:bCs/>
+          <w:color w:val="000000" w:themeColor="text1"/>
+        </w:rPr>
+      </w:pPr>
+      <w:r>
+        <w:rPr>
+          <w:rFonts w:ascii="Times New Roman" w:hAnsi="Times New Roman" w:cs="Times New Roman"/>
+          <w:b/>
+          <w:bCs/>
+          <w:color w:val="000000" w:themeColor="text1"/>
+        </w:rPr>
+        <w:t>Relations:</w:t>
+      </w:r>
+      <w:r>
+        <w:rPr>
+          <w:rFonts w:ascii="Times New Roman" w:hAnsi="Times New Roman" w:cs="Times New Roman"/>
+          <w:b/>
+          <w:bCs/>
+          <w:color w:val="000000" w:themeColor="text1"/>
+        </w:rPr>
+        <w:t xml:space="preserve"> </w:t>
+      </w:r>
+      <w:r>
+        <w:rPr>
+          <w:rFonts w:ascii="Times New Roman" w:hAnsi="Times New Roman" w:cs="Times New Roman"/>
+          <w:color w:val="000000" w:themeColor="text1"/>
+        </w:rPr>
+        <w:t>Association (1-to-1)</w:t>
+      </w:r>
+    </w:p>
+    <w:p>
+      <w:pPr>
+        <w:pStyle w:val="ListParagraph"/>
+        <w:numPr>
+          <w:ilvl w:val="1"/>
+          <w:numId w:val="4"/>
+        </w:numPr>
+        <w:spacing w:line="360" w:lineRule="auto"/>
+        <w:rPr>
+          <w:rFonts w:ascii="Times New Roman" w:hAnsi="Times New Roman" w:cs="Times New Roman"/>
+          <w:b/>
+          <w:bCs/>
+          <w:color w:val="000000" w:themeColor="text1"/>
+        </w:rPr>
+      </w:pPr>
+      <w:r>
+        <w:rPr>
+          <w:rFonts w:ascii="Times New Roman" w:hAnsi="Times New Roman" w:cs="Times New Roman"/>
+          <w:b/>
+          <w:bCs/>
+          <w:color w:val="000000" w:themeColor="text1"/>
+        </w:rPr>
+        <w:t>Explanations:</w:t>
+      </w:r>
+      <w:r>
+        <w:rPr>
+          <w:rFonts w:ascii="Times New Roman" w:hAnsi="Times New Roman" w:cs="Times New Roman"/>
+          <w:b/>
+          <w:bCs/>
+          <w:color w:val="000000" w:themeColor="text1"/>
+        </w:rPr>
+        <w:t xml:space="preserve"> </w:t>
+      </w:r>
+      <w:r>
+        <w:rPr>
+          <w:rFonts w:ascii="Times New Roman" w:hAnsi="Times New Roman" w:cs="Times New Roman"/>
+          <w:color w:val="000000" w:themeColor="text1"/>
+        </w:rPr>
+        <w:t>Each Assessment assesses 1 specific criteria</w:t>
+      </w:r>
+      <w:r>
+        <w:rPr>
+          <w:rFonts w:ascii="Times New Roman" w:hAnsi="Times New Roman" w:cs="Times New Roman"/>
+          <w:color w:val="000000" w:themeColor="text1"/>
+        </w:rPr>
+        <w:t xml:space="preserve">, </w:t>
+      </w:r>
+      <w:r>
+        <w:rPr>
+          <w:rFonts w:ascii="Times New Roman" w:hAnsi="Times New Roman" w:cs="Times New Roman"/>
+          <w:color w:val="000000" w:themeColor="text1"/>
+        </w:rPr>
+        <w:t>allows</w:t>
+      </w:r>
+      <w:r>
+        <w:rPr>
+          <w:rFonts w:ascii="Times New Roman" w:hAnsi="Times New Roman" w:cs="Times New Roman"/>
+          <w:color w:val="000000" w:themeColor="text1"/>
+        </w:rPr>
+        <w:t xml:space="preserve"> to tracking per-criteria value</w:t>
+      </w:r>
+      <w:r>
+        <w:rPr>
+          <w:rFonts w:ascii="Times New Roman" w:hAnsi="Times New Roman" w:cs="Times New Roman"/>
+          <w:color w:val="000000" w:themeColor="text1"/>
+        </w:rPr>
+        <w:t>.</w:t>
+      </w:r>
+    </w:p>
+    <w:p>
+      <w:pPr>
+        <w:pStyle w:val="ListParagraph"/>
+        <w:numPr>
+          <w:ilvl w:val="0"/>
+          <w:numId w:val="4"/>
+        </w:numPr>
+        <w:spacing w:line="360" w:lineRule="auto"/>
+        <w:rPr>
+          <w:rFonts w:ascii="Times New Roman" w:hAnsi="Times New Roman" w:cs="Times New Roman"/>
+          <w:b/>
+          <w:bCs/>
+          <w:color w:val="000000" w:themeColor="text1"/>
+        </w:rPr>
+      </w:pPr>
+      <w:r>
+        <w:rPr>
+          <w:rFonts w:ascii="Times New Roman" w:hAnsi="Times New Roman" w:cs="Times New Roman"/>
+          <w:b/>
+          <w:bCs/>
+          <w:color w:val="000000" w:themeColor="text1"/>
+        </w:rPr>
+        <w:t xml:space="preserve">UKM – </w:t>
+      </w:r>
+      <w:proofErr w:type="spellStart"/>
+      <w:r>
+        <w:rPr>
+          <w:rFonts w:ascii="Times New Roman" w:hAnsi="Times New Roman" w:cs="Times New Roman"/>
+          <w:b/>
+          <w:bCs/>
+          <w:color w:val="000000" w:themeColor="text1"/>
+        </w:rPr>
+        <w:t>UKMCriteria</w:t>
+      </w:r>
+      <w:proofErr w:type="spellEnd"/>
+    </w:p>
+    <w:p>
+      <w:pPr>
+        <w:pStyle w:val="ListParagraph"/>
+        <w:numPr>
+          <w:ilvl w:val="1"/>
+          <w:numId w:val="4"/>
+        </w:numPr>
+        <w:spacing w:line="360" w:lineRule="auto"/>
+        <w:rPr>
+          <w:rFonts w:ascii="Times New Roman" w:hAnsi="Times New Roman" w:cs="Times New Roman"/>
+          <w:b/>
+          <w:bCs/>
+          <w:color w:val="000000" w:themeColor="text1"/>
+        </w:rPr>
+      </w:pPr>
+      <w:r>
+        <w:rPr>
+          <w:rFonts w:ascii="Times New Roman" w:hAnsi="Times New Roman" w:cs="Times New Roman"/>
+          <w:b/>
+          <w:bCs/>
+          <w:color w:val="000000" w:themeColor="text1"/>
+        </w:rPr>
+        <w:t>Relations:</w:t>
+      </w:r>
+      <w:r>
+        <w:rPr>
+          <w:rFonts w:ascii="Times New Roman" w:hAnsi="Times New Roman" w:cs="Times New Roman"/>
+          <w:b/>
+          <w:bCs/>
+          <w:color w:val="000000" w:themeColor="text1"/>
+        </w:rPr>
+        <w:t xml:space="preserve"> </w:t>
+      </w:r>
+      <w:r>
+        <w:rPr>
+          <w:rFonts w:ascii="Times New Roman" w:hAnsi="Times New Roman" w:cs="Times New Roman"/>
+          <w:color w:val="000000" w:themeColor="text1"/>
+        </w:rPr>
+        <w:t>Composition (1-to-Many)</w:t>
+      </w:r>
+    </w:p>
+    <w:p>
+      <w:pPr>
+        <w:pStyle w:val="ListParagraph"/>
+        <w:numPr>
+          <w:ilvl w:val="1"/>
+          <w:numId w:val="4"/>
+        </w:numPr>
+        <w:spacing w:line="360" w:lineRule="auto"/>
+        <w:rPr>
+          <w:rFonts w:ascii="Times New Roman" w:hAnsi="Times New Roman" w:cs="Times New Roman"/>
+          <w:b/>
+          <w:bCs/>
+          <w:color w:val="000000" w:themeColor="text1"/>
+        </w:rPr>
+      </w:pPr>
+      <w:r>
+        <w:rPr>
+          <w:rFonts w:ascii="Times New Roman" w:hAnsi="Times New Roman" w:cs="Times New Roman"/>
+          <w:b/>
+          <w:bCs/>
+          <w:color w:val="000000" w:themeColor="text1"/>
+        </w:rPr>
+        <w:t>Explanations:</w:t>
+      </w:r>
+      <w:r>
+        <w:rPr>
+          <w:rFonts w:ascii="Times New Roman" w:hAnsi="Times New Roman" w:cs="Times New Roman"/>
+          <w:b/>
+          <w:bCs/>
+          <w:color w:val="000000" w:themeColor="text1"/>
+        </w:rPr>
+        <w:t xml:space="preserve"> </w:t>
+      </w:r>
+      <w:r>
+        <w:rPr>
+          <w:rFonts w:ascii="Times New Roman" w:hAnsi="Times New Roman" w:cs="Times New Roman"/>
+          <w:color w:val="000000" w:themeColor="text1"/>
+        </w:rPr>
+        <w:t>1 UKM has many Criteria with different weight</w:t>
+      </w:r>
+      <w:r>
+        <w:rPr>
+          <w:rFonts w:ascii="Times New Roman" w:hAnsi="Times New Roman" w:cs="Times New Roman"/>
+          <w:color w:val="000000" w:themeColor="text1"/>
+        </w:rPr>
+        <w:t>, determine priority for UKM assessments.</w:t>
+      </w:r>
+    </w:p>
+    <w:p>
+      <w:pPr>
+        <w:pStyle w:val="ListParagraph"/>
+        <w:numPr>
+          <w:ilvl w:val="0"/>
+          <w:numId w:val="4"/>
+        </w:numPr>
+        <w:spacing w:line="360" w:lineRule="auto"/>
+        <w:rPr>
+          <w:rFonts w:ascii="Times New Roman" w:hAnsi="Times New Roman" w:cs="Times New Roman"/>
+          <w:b/>
+          <w:bCs/>
+          <w:color w:val="000000" w:themeColor="text1"/>
+        </w:rPr>
+      </w:pPr>
+      <w:proofErr w:type="spellStart"/>
+      <w:r>
+        <w:rPr>
+          <w:rFonts w:ascii="Times New Roman" w:hAnsi="Times New Roman" w:cs="Times New Roman"/>
+          <w:b/>
+          <w:bCs/>
+          <w:color w:val="000000" w:themeColor="text1"/>
+        </w:rPr>
+        <w:t>UKMCriteria</w:t>
+      </w:r>
+      <w:proofErr w:type="spellEnd"/>
+      <w:r>
+        <w:rPr>
+          <w:rFonts w:ascii="Times New Roman" w:hAnsi="Times New Roman" w:cs="Times New Roman"/>
+          <w:b/>
+          <w:bCs/>
+          <w:color w:val="000000" w:themeColor="text1"/>
+        </w:rPr>
+        <w:t xml:space="preserve"> – Criteria</w:t>
+      </w:r>
+    </w:p>
+    <w:p>
+      <w:pPr>
+        <w:pStyle w:val="ListParagraph"/>
+        <w:numPr>
+          <w:ilvl w:val="1"/>
+          <w:numId w:val="4"/>
+        </w:numPr>
+        <w:spacing w:line="360" w:lineRule="auto"/>
+        <w:rPr>
+          <w:rFonts w:ascii="Times New Roman" w:hAnsi="Times New Roman" w:cs="Times New Roman"/>
+          <w:b/>
+          <w:bCs/>
+          <w:color w:val="000000" w:themeColor="text1"/>
+        </w:rPr>
+      </w:pPr>
+      <w:r>
+        <w:rPr>
+          <w:rFonts w:ascii="Times New Roman" w:hAnsi="Times New Roman" w:cs="Times New Roman"/>
+          <w:b/>
+          <w:bCs/>
+          <w:color w:val="000000" w:themeColor="text1"/>
+        </w:rPr>
+        <w:t>Relations:</w:t>
+      </w:r>
+      <w:r>
+        <w:rPr>
+          <w:rFonts w:ascii="Times New Roman" w:hAnsi="Times New Roman" w:cs="Times New Roman"/>
+          <w:b/>
+          <w:bCs/>
+          <w:color w:val="000000" w:themeColor="text1"/>
+        </w:rPr>
+        <w:t xml:space="preserve"> </w:t>
+      </w:r>
+      <w:r>
+        <w:rPr>
+          <w:rFonts w:ascii="Times New Roman" w:hAnsi="Times New Roman" w:cs="Times New Roman"/>
+          <w:color w:val="000000" w:themeColor="text1"/>
+        </w:rPr>
+        <w:t>Association (Many-to-Many)</w:t>
+      </w:r>
+    </w:p>
+    <w:p>
+      <w:pPr>
+        <w:pStyle w:val="ListParagraph"/>
+        <w:numPr>
+          <w:ilvl w:val="1"/>
+          <w:numId w:val="4"/>
+        </w:numPr>
+        <w:spacing w:line="360" w:lineRule="auto"/>
+        <w:rPr>
+          <w:rFonts w:ascii="Times New Roman" w:hAnsi="Times New Roman" w:cs="Times New Roman"/>
+          <w:b/>
+          <w:bCs/>
+          <w:color w:val="000000" w:themeColor="text1"/>
+        </w:rPr>
+      </w:pPr>
+      <w:r>
+        <w:rPr>
+          <w:rFonts w:ascii="Times New Roman" w:hAnsi="Times New Roman" w:cs="Times New Roman"/>
+          <w:b/>
+          <w:bCs/>
+          <w:color w:val="000000" w:themeColor="text1"/>
+        </w:rPr>
+        <w:t>Explanations:</w:t>
+      </w:r>
+      <w:r>
+        <w:rPr>
+          <w:rFonts w:ascii="Times New Roman" w:hAnsi="Times New Roman" w:cs="Times New Roman"/>
+          <w:b/>
+          <w:bCs/>
+          <w:color w:val="000000" w:themeColor="text1"/>
+        </w:rPr>
+        <w:t xml:space="preserve"> </w:t>
+      </w:r>
+      <w:r>
+        <w:rPr>
+          <w:rFonts w:ascii="Times New Roman" w:hAnsi="Times New Roman" w:cs="Times New Roman"/>
+          <w:color w:val="000000" w:themeColor="text1"/>
+        </w:rPr>
+        <w:t>Store criteri</w:t>
+      </w:r>
+      <w:r>
+        <w:rPr>
+          <w:rFonts w:ascii="Times New Roman" w:hAnsi="Times New Roman" w:cs="Times New Roman"/>
+          <w:color w:val="000000" w:themeColor="text1"/>
+        </w:rPr>
+        <w:t>a</w:t>
+      </w:r>
+      <w:r>
+        <w:rPr>
+          <w:rFonts w:ascii="Times New Roman" w:hAnsi="Times New Roman" w:cs="Times New Roman"/>
+          <w:color w:val="000000" w:themeColor="text1"/>
+        </w:rPr>
+        <w:t xml:space="preserve">-specific weights for each </w:t>
+      </w:r>
+      <w:r>
+        <w:rPr>
+          <w:rFonts w:ascii="Times New Roman" w:hAnsi="Times New Roman" w:cs="Times New Roman"/>
+          <w:color w:val="000000" w:themeColor="text1"/>
+        </w:rPr>
+        <w:t>UKM, a</w:t>
+      </w:r>
+      <w:r>
+        <w:rPr>
+          <w:rFonts w:ascii="Times New Roman" w:hAnsi="Times New Roman" w:cs="Times New Roman"/>
+          <w:color w:val="000000" w:themeColor="text1"/>
+        </w:rPr>
+        <w:t xml:space="preserve">llows for weight variation between </w:t>
+      </w:r>
+      <w:r>
+        <w:rPr>
+          <w:rFonts w:ascii="Times New Roman" w:hAnsi="Times New Roman" w:cs="Times New Roman"/>
+          <w:color w:val="000000" w:themeColor="text1"/>
+        </w:rPr>
+        <w:t>UKMs.</w:t>
+      </w:r>
+    </w:p>
+    <w:p>
+      <w:pPr>
+        <w:pStyle w:val="ListParagraph"/>
+        <w:numPr>
+          <w:ilvl w:val="0"/>
+          <w:numId w:val="4"/>
+        </w:numPr>
+        <w:spacing w:line="360" w:lineRule="auto"/>
+        <w:rPr>
+          <w:rFonts w:ascii="Times New Roman" w:hAnsi="Times New Roman" w:cs="Times New Roman"/>
+          <w:b/>
+          <w:bCs/>
+          <w:color w:val="000000" w:themeColor="text1"/>
+        </w:rPr>
+      </w:pPr>
+      <w:r>
+        <w:rPr>
+          <w:rFonts w:ascii="Times New Roman" w:hAnsi="Times New Roman" w:cs="Times New Roman"/>
+          <w:b/>
+          <w:bCs/>
+          <w:color w:val="000000" w:themeColor="text1"/>
+        </w:rPr>
+        <w:t>Recommendation – Assessment</w:t>
+      </w:r>
+    </w:p>
+    <w:p>
+      <w:pPr>
+        <w:pStyle w:val="ListParagraph"/>
+        <w:numPr>
+          <w:ilvl w:val="1"/>
+          <w:numId w:val="4"/>
+        </w:numPr>
+        <w:spacing w:line="360" w:lineRule="auto"/>
+        <w:rPr>
+          <w:rFonts w:ascii="Times New Roman" w:hAnsi="Times New Roman" w:cs="Times New Roman"/>
+          <w:b/>
+          <w:bCs/>
+          <w:color w:val="000000" w:themeColor="text1"/>
+        </w:rPr>
+      </w:pPr>
+      <w:r>
+        <w:rPr>
+          <w:rFonts w:ascii="Times New Roman" w:hAnsi="Times New Roman" w:cs="Times New Roman"/>
+          <w:b/>
+          <w:bCs/>
+          <w:color w:val="000000" w:themeColor="text1"/>
+        </w:rPr>
+        <w:t>Relations:</w:t>
+      </w:r>
+      <w:r>
+        <w:rPr>
+          <w:rFonts w:ascii="Times New Roman" w:hAnsi="Times New Roman" w:cs="Times New Roman"/>
+          <w:b/>
+          <w:bCs/>
+          <w:color w:val="000000" w:themeColor="text1"/>
+        </w:rPr>
+        <w:t xml:space="preserve"> </w:t>
+      </w:r>
+      <w:r>
+        <w:rPr>
+          <w:rFonts w:ascii="Times New Roman" w:hAnsi="Times New Roman" w:cs="Times New Roman"/>
+          <w:color w:val="000000" w:themeColor="text1"/>
+        </w:rPr>
+        <w:t>Dependency (1-to-1)</w:t>
+      </w:r>
+    </w:p>
+    <w:p>
+      <w:pPr>
+        <w:pStyle w:val="ListParagraph"/>
+        <w:numPr>
+          <w:ilvl w:val="1"/>
+          <w:numId w:val="4"/>
+        </w:numPr>
+        <w:spacing w:line="360" w:lineRule="auto"/>
+        <w:rPr>
+          <w:rFonts w:ascii="Times New Roman" w:hAnsi="Times New Roman" w:cs="Times New Roman"/>
+          <w:b/>
+          <w:bCs/>
+          <w:color w:val="000000" w:themeColor="text1"/>
+        </w:rPr>
+      </w:pPr>
+      <w:r>
+        <w:rPr>
+          <w:rFonts w:ascii="Times New Roman" w:hAnsi="Times New Roman" w:cs="Times New Roman"/>
+          <w:b/>
+          <w:bCs/>
+          <w:color w:val="000000" w:themeColor="text1"/>
+        </w:rPr>
+        <w:t>Explanations:</w:t>
+      </w:r>
+      <w:r>
+        <w:rPr>
+          <w:rFonts w:ascii="Times New Roman" w:hAnsi="Times New Roman" w:cs="Times New Roman"/>
+          <w:b/>
+          <w:bCs/>
+          <w:color w:val="000000" w:themeColor="text1"/>
+        </w:rPr>
+        <w:t xml:space="preserve"> </w:t>
+      </w:r>
+      <w:proofErr w:type="spellStart"/>
+      <w:r>
+        <w:rPr>
+          <w:rFonts w:ascii="Times New Roman" w:hAnsi="Times New Roman" w:cs="Times New Roman"/>
+          <w:color w:val="000000" w:themeColor="text1"/>
+        </w:rPr>
+        <w:t>Recomendation</w:t>
+      </w:r>
+      <w:proofErr w:type="spellEnd"/>
+      <w:r>
+        <w:rPr>
+          <w:rFonts w:ascii="Times New Roman" w:hAnsi="Times New Roman" w:cs="Times New Roman"/>
+          <w:color w:val="000000" w:themeColor="text1"/>
+        </w:rPr>
+        <w:t xml:space="preserve"> generated based on Assessment calculation, and 1 Assessment can generate many Recommendation.</w:t>
+      </w:r>
+    </w:p>
+    <w:p>
+      <w:pPr>
+        <w:pStyle w:val="ListParagraph"/>
+        <w:numPr>
+          <w:ilvl w:val="0"/>
+          <w:numId w:val="4"/>
+        </w:numPr>
+        <w:spacing w:line="360" w:lineRule="auto"/>
+        <w:rPr>
+          <w:rFonts w:ascii="Times New Roman" w:hAnsi="Times New Roman" w:cs="Times New Roman"/>
+          <w:b/>
+          <w:bCs/>
+          <w:color w:val="000000" w:themeColor="text1"/>
+        </w:rPr>
+      </w:pPr>
+      <w:r>
+        <w:rPr>
+          <w:rFonts w:ascii="Times New Roman" w:hAnsi="Times New Roman" w:cs="Times New Roman"/>
+          <w:b/>
+          <w:bCs/>
+          <w:color w:val="000000" w:themeColor="text1"/>
+        </w:rPr>
+        <w:t>Recommendation – UKM</w:t>
+      </w:r>
+    </w:p>
+    <w:p>
+      <w:pPr>
+        <w:pStyle w:val="ListParagraph"/>
+        <w:numPr>
+          <w:ilvl w:val="1"/>
+          <w:numId w:val="4"/>
+        </w:numPr>
+        <w:spacing w:line="360" w:lineRule="auto"/>
+        <w:rPr>
+          <w:rFonts w:ascii="Times New Roman" w:hAnsi="Times New Roman" w:cs="Times New Roman"/>
+          <w:b/>
+          <w:bCs/>
+          <w:color w:val="000000" w:themeColor="text1"/>
+        </w:rPr>
+      </w:pPr>
+      <w:r>
+        <w:rPr>
+          <w:rFonts w:ascii="Times New Roman" w:hAnsi="Times New Roman" w:cs="Times New Roman"/>
+          <w:b/>
+          <w:bCs/>
+          <w:color w:val="000000" w:themeColor="text1"/>
+        </w:rPr>
+        <w:t>Relations:</w:t>
+      </w:r>
+      <w:r>
+        <w:rPr>
+          <w:rFonts w:ascii="Times New Roman" w:hAnsi="Times New Roman" w:cs="Times New Roman"/>
+          <w:b/>
+          <w:bCs/>
+          <w:color w:val="000000" w:themeColor="text1"/>
+        </w:rPr>
+        <w:t xml:space="preserve"> </w:t>
+      </w:r>
+      <w:r>
+        <w:rPr>
+          <w:rFonts w:ascii="Times New Roman" w:hAnsi="Times New Roman" w:cs="Times New Roman"/>
+          <w:color w:val="000000" w:themeColor="text1"/>
+        </w:rPr>
+        <w:t>Dependency (1-to-</w:t>
+      </w:r>
+      <w:r>
+        <w:rPr>
+          <w:rFonts w:ascii="Times New Roman" w:hAnsi="Times New Roman" w:cs="Times New Roman"/>
+          <w:color w:val="000000" w:themeColor="text1"/>
+        </w:rPr>
+        <w:t>1</w:t>
+      </w:r>
+      <w:r>
+        <w:rPr>
+          <w:rFonts w:ascii="Times New Roman" w:hAnsi="Times New Roman" w:cs="Times New Roman"/>
+          <w:color w:val="000000" w:themeColor="text1"/>
+        </w:rPr>
+        <w:t>)</w:t>
+      </w:r>
+    </w:p>
+    <w:p>
+      <w:pPr>
+        <w:pStyle w:val="ListParagraph"/>
+        <w:numPr>
+          <w:ilvl w:val="1"/>
+          <w:numId w:val="4"/>
+        </w:numPr>
+        <w:spacing w:line="360" w:lineRule="auto"/>
+        <w:rPr>
+          <w:rFonts w:ascii="Times New Roman" w:hAnsi="Times New Roman" w:cs="Times New Roman"/>
+          <w:b/>
+          <w:bCs/>
+          <w:color w:val="000000" w:themeColor="text1"/>
+        </w:rPr>
+      </w:pPr>
+      <w:r>
+        <w:rPr>
+          <w:rFonts w:ascii="Times New Roman" w:hAnsi="Times New Roman" w:cs="Times New Roman"/>
+          <w:b/>
+          <w:bCs/>
+          <w:color w:val="000000" w:themeColor="text1"/>
+        </w:rPr>
+        <w:t>Explanations:</w:t>
+      </w:r>
+      <w:r>
+        <w:rPr>
+          <w:rFonts w:ascii="Times New Roman" w:hAnsi="Times New Roman" w:cs="Times New Roman"/>
+          <w:b/>
+          <w:bCs/>
+          <w:color w:val="000000" w:themeColor="text1"/>
+        </w:rPr>
+        <w:t xml:space="preserve"> </w:t>
+      </w:r>
+      <w:r>
+        <w:rPr>
+          <w:rFonts w:ascii="Times New Roman" w:hAnsi="Times New Roman" w:cs="Times New Roman"/>
+          <w:color w:val="000000" w:themeColor="text1"/>
+        </w:rPr>
+        <w:t>Every Recommendation leading to specific UKM, d</w:t>
+      </w:r>
+      <w:r>
+        <w:rPr>
+          <w:rFonts w:ascii="Times New Roman" w:hAnsi="Times New Roman" w:cs="Times New Roman"/>
+          <w:color w:val="000000" w:themeColor="text1"/>
+        </w:rPr>
+        <w:t>emonstrate Student</w:t>
+      </w:r>
+      <w:r>
+        <w:rPr>
+          <w:rFonts w:ascii="Times New Roman" w:hAnsi="Times New Roman" w:cs="Times New Roman"/>
+          <w:color w:val="000000" w:themeColor="text1"/>
+        </w:rPr>
+        <w:t>’s</w:t>
+      </w:r>
+      <w:r>
+        <w:rPr>
+          <w:rFonts w:ascii="Times New Roman" w:hAnsi="Times New Roman" w:cs="Times New Roman"/>
+          <w:color w:val="000000" w:themeColor="text1"/>
+        </w:rPr>
+        <w:t xml:space="preserve"> fit with </w:t>
+      </w:r>
+      <w:r>
+        <w:rPr>
+          <w:rFonts w:ascii="Times New Roman" w:hAnsi="Times New Roman" w:cs="Times New Roman"/>
+          <w:color w:val="000000" w:themeColor="text1"/>
+        </w:rPr>
+        <w:t>UKMs.</w:t>
+      </w:r>
+    </w:p>
+    <w:p>
+      <w:pPr>
+        <w:pStyle w:val="ListParagraph"/>
+        <w:numPr>
+          <w:ilvl w:val="0"/>
+          <w:numId w:val="4"/>
+        </w:numPr>
+        <w:spacing w:line="360" w:lineRule="auto"/>
+        <w:rPr>
+          <w:rFonts w:ascii="Times New Roman" w:hAnsi="Times New Roman" w:cs="Times New Roman"/>
+          <w:b/>
+          <w:bCs/>
+          <w:color w:val="000000" w:themeColor="text1"/>
+        </w:rPr>
+      </w:pPr>
+      <w:r>
+        <w:rPr>
+          <w:rFonts w:ascii="Times New Roman" w:hAnsi="Times New Roman" w:cs="Times New Roman"/>
+          <w:b/>
+          <w:bCs/>
+          <w:color w:val="000000" w:themeColor="text1"/>
+        </w:rPr>
+        <w:t>UKM – Student (Leader)</w:t>
+      </w:r>
+    </w:p>
+    <w:p>
+      <w:pPr>
+        <w:pStyle w:val="ListParagraph"/>
+        <w:numPr>
+          <w:ilvl w:val="1"/>
+          <w:numId w:val="4"/>
+        </w:numPr>
+        <w:spacing w:line="360" w:lineRule="auto"/>
+        <w:rPr>
+          <w:rFonts w:ascii="Times New Roman" w:hAnsi="Times New Roman" w:cs="Times New Roman"/>
+          <w:b/>
+          <w:bCs/>
+          <w:color w:val="000000" w:themeColor="text1"/>
+        </w:rPr>
+      </w:pPr>
+      <w:r>
+        <w:rPr>
+          <w:rFonts w:ascii="Times New Roman" w:hAnsi="Times New Roman" w:cs="Times New Roman"/>
+          <w:b/>
+          <w:bCs/>
+          <w:color w:val="000000" w:themeColor="text1"/>
+        </w:rPr>
+        <w:t>Relations:</w:t>
+      </w:r>
+      <w:r>
+        <w:rPr>
+          <w:rFonts w:ascii="Times New Roman" w:hAnsi="Times New Roman" w:cs="Times New Roman"/>
+          <w:b/>
+          <w:bCs/>
+          <w:color w:val="000000" w:themeColor="text1"/>
+        </w:rPr>
+        <w:t xml:space="preserve"> </w:t>
+      </w:r>
+      <w:r>
+        <w:rPr>
+          <w:rFonts w:ascii="Times New Roman" w:hAnsi="Times New Roman" w:cs="Times New Roman"/>
+          <w:color w:val="000000" w:themeColor="text1"/>
+        </w:rPr>
+        <w:t>Association (1-to-1)</w:t>
+      </w:r>
+    </w:p>
+    <w:p>
+      <w:pPr>
+        <w:pStyle w:val="ListParagraph"/>
+        <w:numPr>
+          <w:ilvl w:val="1"/>
+          <w:numId w:val="4"/>
+        </w:numPr>
+        <w:spacing w:line="360" w:lineRule="auto"/>
+        <w:rPr>
+          <w:rFonts w:ascii="Times New Roman" w:hAnsi="Times New Roman" w:cs="Times New Roman"/>
+          <w:b/>
+          <w:bCs/>
+          <w:color w:val="000000" w:themeColor="text1"/>
+        </w:rPr>
+      </w:pPr>
+      <w:r>
+        <w:rPr>
+          <w:rFonts w:ascii="Times New Roman" w:hAnsi="Times New Roman" w:cs="Times New Roman"/>
+          <w:b/>
+          <w:bCs/>
+          <w:color w:val="000000" w:themeColor="text1"/>
+        </w:rPr>
+        <w:t>Explanations:</w:t>
+      </w:r>
+      <w:r>
+        <w:rPr>
+          <w:rFonts w:ascii="Times New Roman" w:hAnsi="Times New Roman" w:cs="Times New Roman"/>
+          <w:b/>
+          <w:bCs/>
+          <w:color w:val="000000" w:themeColor="text1"/>
+        </w:rPr>
+        <w:t xml:space="preserve"> </w:t>
+      </w:r>
+      <w:r>
+        <w:rPr>
+          <w:rFonts w:ascii="Times New Roman" w:hAnsi="Times New Roman" w:cs="Times New Roman"/>
+          <w:color w:val="000000" w:themeColor="text1"/>
+        </w:rPr>
+        <w:t>Every UKM led by 1 Student, and Leader is a registered UKM members.</w:t>
+      </w:r>
+    </w:p>
+    <w:p>
+      <w:pPr>
+        <w:spacing w:line="360" w:lineRule="auto"/>
+        <w:rPr>
+          <w:rFonts w:ascii="Times New Roman" w:hAnsi="Times New Roman" w:cs="Times New Roman"/>
+          <w:b/>
+          <w:bCs/>
+          <w:color w:val="000000" w:themeColor="text1"/>
+        </w:rPr>
+        <w:sectPr>
+          <w:pgSz w:w="12240" w:h="15840"/>
+          <w:pgMar w:top="1440" w:right="1440" w:bottom="1440" w:left="1440" w:header="708" w:footer="708" w:gutter="0"/>
+          <w:cols w:space="708"/>
+          <w:docGrid w:linePitch="360"/>
+        </w:sectPr>
+      </w:pPr>
+    </w:p>
+    <w:p>
+      <w:pPr>
+        <w:spacing w:line="360" w:lineRule="auto"/>
+        <w:rPr>
+          <w:rFonts w:ascii="Times New Roman" w:hAnsi="Times New Roman" w:cs="Times New Roman"/>
+          <w:b/>
+          <w:bCs/>
+          <w:color w:val="000000" w:themeColor="text1"/>
+          <w:u w:val="single"/>
+        </w:rPr>
+      </w:pPr>
+      <w:r>
+        <w:rPr>
+          <w:rFonts w:ascii="Times New Roman" w:hAnsi="Times New Roman" w:cs="Times New Roman"/>
+          <w:b/>
+          <w:bCs/>
+          <w:color w:val="000000" w:themeColor="text1"/>
+          <w:u w:val="single"/>
+        </w:rPr>
+        <w:lastRenderedPageBreak/>
+        <w:t>CLASS DIAGRAM</w:t>
+      </w:r>
+    </w:p>
+    <w:p>
+      <w:pPr>
+        <w:spacing w:line="360" w:lineRule="auto"/>
+        <w:rPr>
+          <w:rFonts w:ascii="Times New Roman" w:hAnsi="Times New Roman" w:cs="Times New Roman"/>
+          <w:b/>
+          <w:bCs/>
+          <w:color w:val="000000" w:themeColor="text1"/>
+        </w:rPr>
+      </w:pPr>
+      <w:r>
+        <w:rPr>
+          <w:rFonts w:ascii="Times New Roman" w:hAnsi="Times New Roman" w:cs="Times New Roman"/>
+          <w:b/>
+          <w:bCs/>
+          <w:noProof/>
+          <w:color w:val="000000" w:themeColor="text1"/>
+        </w:rPr>
+        <w:drawing>
+          <wp:inline distT="0" distB="0" distL="0" distR="0" wp14:anchorId="04F36CDC" wp14:editId="552FE7AA">
+            <wp:extent cx="5943600" cy="4364355"/>
+            <wp:effectExtent l="12700" t="12700" r="12700" b="17145"/>
+            <wp:docPr id="917796202" name="Picture 1" descr="A diagram of a program&#10;&#10;AI-generated content may be incorrect."/>
+            <wp:cNvGraphicFramePr>
+              <a:graphicFrameLocks xmlns:a="http://schemas.openxmlformats.org/drawingml/2006/main" noChangeAspect="1"/>
+            </wp:cNvGraphicFramePr>
+            <a:graphic xmlns:a="http://schemas.openxmlformats.org/drawingml/2006/main">
+              <a:graphicData uri="http://schemas.openxmlformats.org/drawingml/2006/picture">
+                <pic:pic xmlns:pic="http://schemas.openxmlformats.org/drawingml/2006/picture">
+                  <pic:nvPicPr>
+                    <pic:cNvPr id="917796202" name="Picture 1" descr="A diagram of a program&#10;&#10;AI-generated content may be incorrect."/>
+                    <pic:cNvPicPr/>
+                  </pic:nvPicPr>
+                  <pic:blipFill>
+                    <a:blip r:embed="rId7" cstate="print">
+                      <a:extLst>
+                        <a:ext uri="{28A0092B-C50C-407E-A947-70E740481C1C}">
+                          <a14:useLocalDpi xmlns:a14="http://schemas.microsoft.com/office/drawing/2010/main" val="0"/>
+                        </a:ext>
+                      </a:extLst>
+                    </a:blip>
+                    <a:stretch>
+                      <a:fillRect/>
+                    </a:stretch>
+                  </pic:blipFill>
+                  <pic:spPr>
+                    <a:xfrm>
+                      <a:off x="0" y="0"/>
+                      <a:ext cx="5943600" cy="4364355"/>
+                    </a:xfrm>
+                    <a:prstGeom prst="rect">
+                      <a:avLst/>
+                    </a:prstGeom>
+                    <a:ln>
+                      <a:solidFill>
+                        <a:schemeClr val="tx1"/>
+                      </a:solidFill>
+                    </a:ln>
+                  </pic:spPr>
+                </pic:pic>
+              </a:graphicData>
+            </a:graphic>
+          </wp:inline>
+        </w:drawing>
+      </w:r>
     </w:p>
     <w:sectPr>
       <w:pgSz w:w="12240" w:h="15840"/>
@@ -2204,7 +4029,7 @@
   <w:abstractNum w:abstractNumId="1" w15:restartNumberingAfterBreak="0">
     <w:nsid w:val="0E0A3D96"/>
     <w:multiLevelType w:val="hybridMultilevel"/>
-    <w:tmpl w:val="CEBE06A6"/>
+    <w:tmpl w:val="C6E49692"/>
     <w:lvl w:ilvl="0" w:tplc="04090001">
       <w:start w:val="1"/>
       <w:numFmt w:val="bullet"/>
@@ -2217,16 +4042,16 @@
         <w:rFonts w:ascii="Symbol" w:hAnsi="Symbol" w:hint="default"/>
       </w:rPr>
     </w:lvl>
-    <w:lvl w:ilvl="1" w:tplc="04090003" w:tentative="1">
+    <w:lvl w:ilvl="1" w:tplc="04090005">
       <w:start w:val="1"/>
       <w:numFmt w:val="bullet"/>
-      <w:lvlText w:val="o"/>
+      <w:lvlText w:val=""/>
       <w:lvlJc w:val="left"/>
       <w:pPr>
         <w:ind w:left="1440" w:hanging="360"/>
       </w:pPr>
       <w:rPr>
-        <w:rFonts w:ascii="Courier New" w:hAnsi="Courier New" w:hint="default"/>
+        <w:rFonts w:ascii="Wingdings" w:hAnsi="Wingdings" w:hint="default"/>
       </w:rPr>
     </w:lvl>
     <w:lvl w:ilvl="2" w:tplc="04090005" w:tentative="1">

</xml_diff>